<commit_message>
docs: update deck and script to cover the IoT sensor network
The presentation still described the pre-IoT version of the project: 8
endpoints, no sensor slide, "4 tiers" as the whole architecture. Now:

- New slide 7 (Capteurs IoT): the six measured values, the five alert rules,
  the field-to-screen chain
- Slide 6 architecture diagram gains a field layer ahead of the 4 tiers
- Slide 9 (API) rebuilt for 18 endpoints across 4 groups (auth, parcels,
  sensors, diagnosis) instead of the old 8
- Slide 13 metrics: endpoint count and one KPI swapped for the sensor
  cadence (1 reading/min)
- SOUTENANCE.docx: full rewrite for 16 slides, three new speaker notes on
  the sensor logic, and 5 new Q&A entries (are the sensors real, how would
  you switch to physical ones, why leaf wetness, what happens when a sensor
  drops offline)

Co-Authored-By: Claude Sonnet 5 <noreply@anthropic.com>
</commit_message>
<xml_diff>
--- a/SOUTENANCE.docx
+++ b/SOUTENANCE.docx
@@ -63,7 +63,7 @@
           <w:color w:val="5F6B5F"/>
           <w:sz w:val="26"/>
         </w:rPr>
-        <w:t>Durée : 15 minutes</w:t>
+        <w:t>16 diapositives — 15 minutes</w:t>
       </w:r>
     </w:p>
     <w:p>
@@ -231,7 +231,7 @@
               <w:rPr>
                 <w:sz w:val="22"/>
               </w:rPr>
-              <w:t>2 min 30</w:t>
+              <w:t>2 min</w:t>
             </w:r>
           </w:p>
         </w:tc>
@@ -275,7 +275,7 @@
               <w:rPr>
                 <w:sz w:val="22"/>
               </w:rPr>
-              <w:t>4 min</w:t>
+              <w:t>3 min 30</w:t>
             </w:r>
           </w:p>
         </w:tc>
@@ -305,7 +305,7 @@
               <w:rPr>
                 <w:sz w:val="22"/>
               </w:rPr>
-              <w:t>Architecture et technologies imposées</w:t>
+              <w:t>Architecture réseau et capteurs IoT</w:t>
             </w:r>
           </w:p>
         </w:tc>
@@ -319,7 +319,7 @@
               <w:rPr>
                 <w:sz w:val="22"/>
               </w:rPr>
-              <w:t>3 min 30</w:t>
+              <w:t>2 min 30</w:t>
             </w:r>
           </w:p>
         </w:tc>
@@ -349,7 +349,7 @@
               <w:rPr>
                 <w:sz w:val="22"/>
               </w:rPr>
-              <w:t>API, intelligence artificielle et sécurité</w:t>
+              <w:t>Technologies, API et intelligence artificielle</w:t>
             </w:r>
           </w:p>
         </w:tc>
@@ -363,7 +363,7 @@
               <w:rPr>
                 <w:sz w:val="22"/>
               </w:rPr>
-              <w:t>3 min</w:t>
+              <w:t>2 min 35</w:t>
             </w:r>
           </w:p>
         </w:tc>
@@ -393,7 +393,7 @@
               <w:rPr>
                 <w:sz w:val="22"/>
               </w:rPr>
-              <w:t>Déploiement, résultats et compétences</w:t>
+              <w:t>Sécurité, déploiement et résultats</w:t>
             </w:r>
           </w:p>
         </w:tc>
@@ -407,7 +407,7 @@
               <w:rPr>
                 <w:sz w:val="22"/>
               </w:rPr>
-              <w:t>3 min 15</w:t>
+              <w:t>2 min 10</w:t>
             </w:r>
           </w:p>
         </w:tc>
@@ -423,7 +423,7 @@
               <w:rPr>
                 <w:sz w:val="22"/>
               </w:rPr>
-              <w:t>14 et 15</w:t>
+              <w:t>14 à 16</w:t>
             </w:r>
           </w:p>
         </w:tc>
@@ -437,7 +437,7 @@
               <w:rPr>
                 <w:sz w:val="22"/>
               </w:rPr>
-              <w:t>Conclusion et questions</w:t>
+              <w:t>Compétences, conclusion et questions</w:t>
             </w:r>
           </w:p>
         </w:tc>
@@ -451,7 +451,7 @@
               <w:rPr>
                 <w:sz w:val="22"/>
               </w:rPr>
-              <w:t>2 min 30</w:t>
+              <w:t>2 min 25</w:t>
             </w:r>
           </w:p>
         </w:tc>
@@ -474,7 +474,7 @@
           <w:color w:val="5F6B5F"/>
           <w:sz w:val="21"/>
         </w:rPr>
-        <w:t>Conseil : gardez ce document sous les yeux. Les phrases en gris sont à dire, les lignes « À l'écran » rappellent ce que le public voit.</w:t>
+        <w:t>Conseil : gardez ce document sous les yeux. Les lignes « À l'écran » rappellent ce que le public voit, le reste est à dire.</w:t>
       </w:r>
     </w:p>
     <w:p>
@@ -595,7 +595,7 @@
           <w:color w:val="2B2B2B"/>
           <w:sz w:val="21"/>
         </w:rPr>
-        <w:t>1 min 50</w:t>
+        <w:t>1 min 20</w:t>
       </w:r>
     </w:p>
     <w:p>
@@ -652,7 +652,7 @@
           <w:color w:val="2B2B2B"/>
           <w:sz w:val="23"/>
         </w:rPr>
-        <w:t>Aujourd'hui, l'identification est soit manuelle — longue et imprécise, elle dépend de l'expérience de chacun — soit confiée à un technicien, ce qui prend du temps et coûte cher. Et il n'existe rien d'accessible pour les petites et moyennes exploitations.</w:t>
+        <w:t>Aujourd'hui, l'identification est soit manuelle — longue et imprécise — soit confiée à un technicien, ce qui prend du temps et coûte cher. Rien d'accessible n'existe pour les petites et moyennes exploitations.</w:t>
       </w:r>
     </w:p>
     <w:p>
@@ -667,7 +667,7 @@
           <w:color w:val="2B2B2B"/>
           <w:sz w:val="23"/>
         </w:rPr>
-        <w:t>Notre réponse, c'est PlantDiag : photographier une feuille et obtenir un diagnostic immédiat. Simple, rapide, accessible, précis.</w:t>
+        <w:t>Notre réponse : photographier une feuille et obtenir un diagnostic immédiat, doublé d'une surveillance permanente des parcelles par des capteurs.</w:t>
       </w:r>
     </w:p>
     <w:p>
@@ -683,6 +683,254 @@
           <w:sz w:val="34"/>
         </w:rPr>
         <w:t>Diapositive 3 — Objectifs du cahier des charges</w:t>
+      </w:r>
+    </w:p>
+    <w:p>
+      <w:pPr>
+        <w:spacing w:after="80"/>
+      </w:pPr>
+      <w:r>
+        <w:rPr>
+          <w:rFonts w:ascii="Calibri" w:hAnsi="Calibri"/>
+          <w:b/>
+          <w:color w:val="2C5F2D"/>
+          <w:sz w:val="21"/>
+        </w:rPr>
+        <w:t xml:space="preserve">Durée : </w:t>
+      </w:r>
+      <w:r>
+        <w:rPr>
+          <w:rFonts w:ascii="Calibri" w:hAnsi="Calibri"/>
+          <w:color w:val="2B2B2B"/>
+          <w:sz w:val="21"/>
+        </w:rPr>
+        <w:t>25 secondes</w:t>
+      </w:r>
+    </w:p>
+    <w:p>
+      <w:pPr>
+        <w:spacing w:after="80"/>
+      </w:pPr>
+      <w:r>
+        <w:rPr>
+          <w:rFonts w:ascii="Calibri" w:hAnsi="Calibri"/>
+          <w:b/>
+          <w:color w:val="2C5F2D"/>
+          <w:sz w:val="21"/>
+        </w:rPr>
+        <w:t xml:space="preserve">À l'écran : </w:t>
+      </w:r>
+      <w:r>
+        <w:rPr>
+          <w:rFonts w:ascii="Calibri" w:hAnsi="Calibri"/>
+          <w:color w:val="2B2B2B"/>
+          <w:sz w:val="21"/>
+        </w:rPr>
+        <w:t>Cinq objectifs marqués « Réalisé » et un bandeau 100 %.</w:t>
+      </w:r>
+    </w:p>
+    <w:p>
+      <w:pPr>
+        <w:spacing w:after="40" w:before="0"/>
+      </w:pPr>
+    </w:p>
+    <w:p>
+      <w:pPr>
+        <w:spacing w:after="160" w:before="0"/>
+      </w:pPr>
+      <w:r>
+        <w:rPr>
+          <w:rFonts w:ascii="Calibri" w:hAnsi="Calibri"/>
+          <w:b w:val="0"/>
+          <w:i w:val="0"/>
+          <w:color w:val="2B2B2B"/>
+          <w:sz w:val="23"/>
+        </w:rPr>
+        <w:t>Le cahier des charges demandait cinq choses : une application mobile web responsive, une fonctionnalité d'intelligence artificielle, un déploiement cloud, une architecture réseau intégrant des capteurs IoT, et trois technologies imposées avec leur documentation.</w:t>
+      </w:r>
+    </w:p>
+    <w:p>
+      <w:pPr>
+        <w:spacing w:after="160" w:before="0"/>
+      </w:pPr>
+      <w:r>
+        <w:rPr>
+          <w:rFonts w:ascii="Calibri" w:hAnsi="Calibri"/>
+          <w:b w:val="0"/>
+          <w:i w:val="0"/>
+          <w:color w:val="2B2B2B"/>
+          <w:sz w:val="23"/>
+        </w:rPr>
+        <w:t>Les cinq objectifs sont atteints et vérifiables en production.</w:t>
+      </w:r>
+    </w:p>
+    <w:p>
+      <w:pPr>
+        <w:spacing w:after="40" w:before="280"/>
+      </w:pPr>
+      <w:r>
+        <w:rPr>
+          <w:rFonts w:ascii="Cambria" w:hAnsi="Cambria"/>
+          <w:b/>
+          <w:i w:val="0"/>
+          <w:color w:val="2C5F2D"/>
+          <w:sz w:val="34"/>
+        </w:rPr>
+        <w:t>Diapositive 4 — Démonstration en direct</w:t>
+      </w:r>
+    </w:p>
+    <w:p>
+      <w:pPr>
+        <w:spacing w:after="80"/>
+      </w:pPr>
+      <w:r>
+        <w:rPr>
+          <w:rFonts w:ascii="Calibri" w:hAnsi="Calibri"/>
+          <w:b/>
+          <w:color w:val="2C5F2D"/>
+          <w:sz w:val="21"/>
+        </w:rPr>
+        <w:t xml:space="preserve">Durée : </w:t>
+      </w:r>
+      <w:r>
+        <w:rPr>
+          <w:rFonts w:ascii="Calibri" w:hAnsi="Calibri"/>
+          <w:color w:val="2B2B2B"/>
+          <w:sz w:val="21"/>
+        </w:rPr>
+        <w:t>3 minutes</w:t>
+      </w:r>
+    </w:p>
+    <w:p>
+      <w:pPr>
+        <w:spacing w:after="80"/>
+      </w:pPr>
+      <w:r>
+        <w:rPr>
+          <w:rFonts w:ascii="Calibri" w:hAnsi="Calibri"/>
+          <w:b/>
+          <w:color w:val="2C5F2D"/>
+          <w:sz w:val="21"/>
+        </w:rPr>
+        <w:t xml:space="preserve">À l'écran : </w:t>
+      </w:r>
+      <w:r>
+        <w:rPr>
+          <w:rFonts w:ascii="Calibri" w:hAnsi="Calibri"/>
+          <w:color w:val="2B2B2B"/>
+          <w:sz w:val="21"/>
+        </w:rPr>
+        <w:t>L'adresse de l'application et les six étapes du parcours.</w:t>
+      </w:r>
+    </w:p>
+    <w:p>
+      <w:pPr>
+        <w:spacing w:after="40" w:before="0"/>
+      </w:pPr>
+    </w:p>
+    <w:p>
+      <w:pPr>
+        <w:spacing w:after="160" w:before="0"/>
+      </w:pPr>
+      <w:r>
+        <w:rPr>
+          <w:rFonts w:ascii="Calibri" w:hAnsi="Calibri"/>
+          <w:b w:val="0"/>
+          <w:i w:val="0"/>
+          <w:color w:val="2B2B2B"/>
+          <w:sz w:val="23"/>
+        </w:rPr>
+        <w:t>Passons à la démonstration. L'application tourne en production à l'adresse affichée.</w:t>
+      </w:r>
+    </w:p>
+    <w:p>
+      <w:pPr>
+        <w:spacing w:after="160" w:before="0"/>
+      </w:pPr>
+      <w:r>
+        <w:rPr>
+          <w:rFonts w:ascii="Calibri" w:hAnsi="Calibri"/>
+          <w:b w:val="0"/>
+          <w:i w:val="0"/>
+          <w:color w:val="2B2B2B"/>
+          <w:sz w:val="23"/>
+        </w:rPr>
+        <w:t>Je crée d'abord une parcelle, avec un nom de champ et un type de culture. Elle part directement en base de données.</w:t>
+      </w:r>
+    </w:p>
+    <w:p>
+      <w:pPr>
+        <w:spacing w:after="160" w:before="0"/>
+      </w:pPr>
+      <w:r>
+        <w:rPr>
+          <w:rFonts w:ascii="Calibri" w:hAnsi="Calibri"/>
+          <w:b w:val="0"/>
+          <w:i w:val="0"/>
+          <w:color w:val="2B2B2B"/>
+          <w:sz w:val="23"/>
+        </w:rPr>
+        <w:t>Ensuite, onglet Diagnostic : j'envoie une photo de feuille. L'analyse prend environ une seconde et demie. Vous voyez la maladie détectée, l'indice de confiance, la sévérité et les traitements recommandés.</w:t>
+      </w:r>
+    </w:p>
+    <w:p>
+      <w:pPr>
+        <w:spacing w:after="160" w:before="0"/>
+      </w:pPr>
+      <w:r>
+        <w:rPr>
+          <w:rFonts w:ascii="Calibri" w:hAnsi="Calibri"/>
+          <w:b w:val="0"/>
+          <w:i w:val="0"/>
+          <w:color w:val="2B2B2B"/>
+          <w:sz w:val="23"/>
+        </w:rPr>
+        <w:t>Onglet Capteurs : voici le réseau. Chaque parcelle a son boîtier, qui remonte six mesures. Vous voyez le nombre de capteurs en ligne et le nombre total de trames reçues depuis le démarrage. Les valeurs changent à chaque minute.</w:t>
+      </w:r>
+    </w:p>
+    <w:p>
+      <w:pPr>
+        <w:spacing w:after="160" w:before="0"/>
+      </w:pPr>
+      <w:r>
+        <w:rPr>
+          <w:rFonts w:ascii="Calibri" w:hAnsi="Calibri"/>
+          <w:b w:val="0"/>
+          <w:i w:val="0"/>
+          <w:color w:val="2B2B2B"/>
+          <w:sz w:val="23"/>
+        </w:rPr>
+        <w:t>Onglet Alertes : c'est là que tout se croise. Le serveur compare les relevés des capteurs, le dernier diagnostic et la météo, puis classe les alertes par gravité.</w:t>
+      </w:r>
+    </w:p>
+    <w:p>
+      <w:pPr>
+        <w:spacing w:after="160" w:before="0"/>
+      </w:pPr>
+      <w:r>
+        <w:rPr>
+          <w:rFonts w:ascii="Calibri" w:hAnsi="Calibri"/>
+          <w:b w:val="0"/>
+          <w:i w:val="0"/>
+          <w:color w:val="2B2B2B"/>
+          <w:sz w:val="23"/>
+        </w:rPr>
+        <w:t>Enfin la météo : je peux chercher une ville, voir les prévisions sur cinq jours, et enregistrer mes villes favorites.</w:t>
+      </w:r>
+    </w:p>
+    <w:p>
+      <w:pPr>
+        <w:spacing w:after="40" w:before="280"/>
+      </w:pPr>
+      <w:r>
+        <w:rPr>
+          <w:rFonts w:ascii="Cambria" w:hAnsi="Cambria"/>
+          <w:b/>
+          <w:i w:val="0"/>
+          <w:color w:val="2C5F2D"/>
+          <w:sz w:val="34"/>
+        </w:rPr>
+        <w:t>Diapositive 5 — Fonctionnalités</w:t>
       </w:r>
     </w:p>
     <w:p>
@@ -726,7 +974,7 @@
           <w:color w:val="2B2B2B"/>
           <w:sz w:val="21"/>
         </w:rPr>
-        <w:t>Cinq objectifs, chacun marqué « Réalisé », et un bandeau 100 %.</w:t>
+        <w:t>Six modules présentés en grille.</w:t>
       </w:r>
     </w:p>
     <w:p>
@@ -746,7 +994,7 @@
           <w:color w:val="2B2B2B"/>
           <w:sz w:val="23"/>
         </w:rPr>
-        <w:t>Le cahier des charges demandait cinq choses : une application mobile web responsive, une fonctionnalité d'intelligence artificielle, un déploiement cloud, trois technologies imposées, et une documentation complète de l'architecture.</w:t>
+        <w:t>Pour récapituler : diagnostic par image, capteurs de parcelle, gestion des parcelles, historique complet, météo en temps réel et alertes croisées.</w:t>
       </w:r>
     </w:p>
     <w:p>
@@ -761,7 +1009,7 @@
           <w:color w:val="2B2B2B"/>
           <w:sz w:val="23"/>
         </w:rPr>
-        <w:t>Les cinq objectifs sont atteints et vérifiables en production.</w:t>
+        <w:t>Tout est persistant en base : rien ne dépend du navigateur.</w:t>
       </w:r>
     </w:p>
     <w:p>
@@ -776,7 +1024,7 @@
           <w:color w:val="2C5F2D"/>
           <w:sz w:val="34"/>
         </w:rPr>
-        <w:t>Diapositive 4 — Démonstration en direct</w:t>
+        <w:t>Diapositive 6 — Architecture réseau</w:t>
       </w:r>
     </w:p>
     <w:p>
@@ -798,7 +1046,7 @@
           <w:color w:val="2B2B2B"/>
           <w:sz w:val="21"/>
         </w:rPr>
-        <w:t>3 minutes</w:t>
+        <w:t>1 min 20</w:t>
       </w:r>
     </w:p>
     <w:p>
@@ -820,7 +1068,7 @@
           <w:color w:val="2B2B2B"/>
           <w:sz w:val="21"/>
         </w:rPr>
-        <w:t>L'adresse de l'application et les six étapes du parcours.</w:t>
+        <w:t>La couche terrain et les quatre tiers, puis le flux de données.</w:t>
       </w:r>
     </w:p>
     <w:p>
@@ -840,7 +1088,7 @@
           <w:color w:val="2B2B2B"/>
           <w:sz w:val="23"/>
         </w:rPr>
-        <w:t>Passons à la démonstration. L'application tourne en production à l'adresse affichée.</w:t>
+        <w:t>L'architecture part du terrain. Chaque parcelle porte un capteur qui envoie ses mesures à l'API.</w:t>
       </w:r>
     </w:p>
     <w:p>
@@ -855,7 +1103,7 @@
           <w:color w:val="2B2B2B"/>
           <w:sz w:val="23"/>
         </w:rPr>
-        <w:t>Je crée d'abord une parcelle, avec un nom de champ et un type de culture.</w:t>
+        <w:t>Viennent ensuite quatre tiers. Le tier 1, la présentation : le frontend responsive. Le tier 2, le métier : l'API REST FastAPI qui porte toute la logique. Le tier 3, les données : PostgreSQL pour le stockage, Redis pour le cache. Le tier 4, les services externes : OpenCV pour l'image et Open-Meteo pour la météo.</w:t>
       </w:r>
     </w:p>
     <w:p>
@@ -870,52 +1118,7 @@
           <w:color w:val="2B2B2B"/>
           <w:sz w:val="23"/>
         </w:rPr>
-        <w:t>Ensuite je vais dans l'onglet Diagnostic et j'envoie une photo de feuille. L'analyse prend environ une seconde et demie. Vous voyez ici la maladie détectée, l'indice de confiance à 87 %, la sévérité et les traitements recommandés.</w:t>
-      </w:r>
-    </w:p>
-    <w:p>
-      <w:pPr>
-        <w:spacing w:after="160" w:before="0"/>
-      </w:pPr>
-      <w:r>
-        <w:rPr>
-          <w:rFonts w:ascii="Calibri" w:hAnsi="Calibri"/>
-          <w:b w:val="0"/>
-          <w:i w:val="0"/>
-          <w:color w:val="2B2B2B"/>
-          <w:sz w:val="23"/>
-        </w:rPr>
-        <w:t>L'onglet Historique conserve tous les diagnostics en base de données.</w:t>
-      </w:r>
-    </w:p>
-    <w:p>
-      <w:pPr>
-        <w:spacing w:after="160" w:before="0"/>
-      </w:pPr>
-      <w:r>
-        <w:rPr>
-          <w:rFonts w:ascii="Calibri" w:hAnsi="Calibri"/>
-          <w:b w:val="0"/>
-          <w:i w:val="0"/>
-          <w:color w:val="2B2B2B"/>
-          <w:sz w:val="23"/>
-        </w:rPr>
-        <w:t>L'onglet Alertes affiche les risques calculés pour ma région : ils ne sont pas les mêmes dans le Nord et dans le Sud, puisqu'ils dépendent de la météo locale.</w:t>
-      </w:r>
-    </w:p>
-    <w:p>
-      <w:pPr>
-        <w:spacing w:after="160" w:before="0"/>
-      </w:pPr>
-      <w:r>
-        <w:rPr>
-          <w:rFonts w:ascii="Calibri" w:hAnsi="Calibri"/>
-          <w:b w:val="0"/>
-          <w:i w:val="0"/>
-          <w:color w:val="2B2B2B"/>
-          <w:sz w:val="23"/>
-        </w:rPr>
-        <w:t>Enfin, la météo : je peux chercher une ville, voir les prévisions sur cinq jours, et enregistrer mes villes favorites.</w:t>
+        <w:t>Le flux d'un diagnostic est simple : la photo part du navigateur vers l'API, elle est analysée par OpenCV, le résultat est écrit en base, puis renvoyé en JSON.</w:t>
       </w:r>
     </w:p>
     <w:p>
@@ -930,7 +1133,7 @@
           <w:color w:val="2C5F2D"/>
           <w:sz w:val="34"/>
         </w:rPr>
-        <w:t>Diapositive 5 — Fonctionnalités</w:t>
+        <w:t>Diapositive 7 — Capteurs IoT</w:t>
       </w:r>
     </w:p>
     <w:p>
@@ -952,7 +1155,7 @@
           <w:color w:val="2B2B2B"/>
           <w:sz w:val="21"/>
         </w:rPr>
-        <w:t>1 minute</w:t>
+        <w:t>1 min 10</w:t>
       </w:r>
     </w:p>
     <w:p>
@@ -974,7 +1177,7 @@
           <w:color w:val="2B2B2B"/>
           <w:sz w:val="21"/>
         </w:rPr>
-        <w:t>Six modules présentés en grille.</w:t>
+        <w:t>Les six grandeurs mesurées à gauche, les règles d'alerte à droite, la chaîne en bas.</w:t>
       </w:r>
     </w:p>
     <w:p>
@@ -994,7 +1197,7 @@
           <w:color w:val="2B2B2B"/>
           <w:sz w:val="23"/>
         </w:rPr>
-        <w:t>Pour récapituler : diagnostic par image, gestion des parcelles, historique complet, météo en temps réel, alertes régionales et comptes sécurisés.</w:t>
+        <w:t>Parlons des capteurs, parce que c'est ce qui rend la surveillance continue.</w:t>
       </w:r>
     </w:p>
     <w:p>
@@ -1009,7 +1212,52 @@
           <w:color w:val="2B2B2B"/>
           <w:sz w:val="23"/>
         </w:rPr>
-        <w:t>Tout est persistant — rien ne se perd entre deux sessions.</w:t>
+        <w:t>Chaque boîtier mesure six grandeurs : l'humidité et la température du sol, la température et l'hygrométrie de l'air, l'humectation du feuillage, et son propre niveau de batterie. Il envoie une trame JSON par minute, en HTTP, vers l'API.</w:t>
+      </w:r>
+    </w:p>
+    <w:p>
+      <w:pPr>
+        <w:spacing w:after="160" w:before="0"/>
+      </w:pPr>
+      <w:r>
+        <w:rPr>
+          <w:rFonts w:ascii="Calibri" w:hAnsi="Calibri"/>
+          <w:b w:val="0"/>
+          <w:i w:val="0"/>
+          <w:color w:val="2B2B2B"/>
+          <w:sz w:val="23"/>
+        </w:rPr>
+        <w:t>La grandeur la plus importante pour nous est l'humectation foliaire. Quand le feuillage reste mouillé et que la température est douce, entre 15 et 25 degrés, les spores germent. C'est exactement la règle que vous voyez en haut à droite.</w:t>
+      </w:r>
+    </w:p>
+    <w:p>
+      <w:pPr>
+        <w:spacing w:after="160" w:before="0"/>
+      </w:pPr>
+      <w:r>
+        <w:rPr>
+          <w:rFonts w:ascii="Calibri" w:hAnsi="Calibri"/>
+          <w:b w:val="0"/>
+          <w:i w:val="0"/>
+          <w:color w:val="2B2B2B"/>
+          <w:sz w:val="23"/>
+        </w:rPr>
+        <w:t>Le serveur détecte aussi le stress hydrique, l'excès d'eau, une batterie faible et un capteur devenu muet depuis plus de quinze minutes.</w:t>
+      </w:r>
+    </w:p>
+    <w:p>
+      <w:pPr>
+        <w:spacing w:after="160" w:before="0"/>
+      </w:pPr>
+      <w:r>
+        <w:rPr>
+          <w:rFonts w:ascii="Calibri" w:hAnsi="Calibri"/>
+          <w:b w:val="0"/>
+          <w:i w:val="0"/>
+          <w:color w:val="2B2B2B"/>
+          <w:sz w:val="23"/>
+        </w:rPr>
+        <w:t>Aujourd'hui, ces capteurs sont simulés par un conteneur dédié — le cahier des charges l'autorise explicitement. Mais ils parlent le même protocole que de vrais boîtiers : les remplacer ne demanderait aucune modification de l'API.</w:t>
       </w:r>
     </w:p>
     <w:p>
@@ -1024,7 +1272,7 @@
           <w:color w:val="2C5F2D"/>
           <w:sz w:val="34"/>
         </w:rPr>
-        <w:t>Diapositive 6 — Architecture réseau</w:t>
+        <w:t>Diapositive 8 — Technologies imposées</w:t>
       </w:r>
     </w:p>
     <w:p>
@@ -1046,7 +1294,7 @@
           <w:color w:val="2B2B2B"/>
           <w:sz w:val="21"/>
         </w:rPr>
-        <w:t>2 minutes</w:t>
+        <w:t>1 min 05</w:t>
       </w:r>
     </w:p>
     <w:p>
@@ -1068,7 +1316,7 @@
           <w:color w:val="2B2B2B"/>
           <w:sz w:val="21"/>
         </w:rPr>
-        <w:t>Les quatre tiers côte à côte et le flux de données en bandeau.</w:t>
+        <w:t>Les trois technologies en colonnes, avec la justification de chacune.</w:t>
       </w:r>
     </w:p>
     <w:p>
@@ -1088,7 +1336,7 @@
           <w:color w:val="2B2B2B"/>
           <w:sz w:val="23"/>
         </w:rPr>
-        <w:t>L'architecture est organisée en quatre tiers.</w:t>
+        <w:t>Le cahier des charges imposait trois technologies.</w:t>
       </w:r>
     </w:p>
     <w:p>
@@ -1103,7 +1351,7 @@
           <w:color w:val="2B2B2B"/>
           <w:sz w:val="23"/>
         </w:rPr>
-        <w:t>Le tier 1, la présentation : le frontend HTML, CSS et JavaScript, responsive, qui fonctionne sur mobile comme sur ordinateur.</w:t>
+        <w:t>FastAPI pour le backend : asynchrone, validation native, documentation automatique. Pas Node.js, parce que Python domine la vision par ordinateur.</w:t>
       </w:r>
     </w:p>
     <w:p>
@@ -1118,7 +1366,7 @@
           <w:color w:val="2B2B2B"/>
           <w:sz w:val="23"/>
         </w:rPr>
-        <w:t>Le tier 2, le métier : l'API REST que j'ai construite en FastAPI. C'est elle qui porte toute la logique.</w:t>
+        <w:t>PostgreSQL pour les données : transactions ACID et modèle relationnel. Pas MongoDB, parce que les relations entre utilisateur, parcelle, diagnostic et relevé sont structurées.</w:t>
       </w:r>
     </w:p>
     <w:p>
@@ -1133,8 +1381,72 @@
           <w:color w:val="2B2B2B"/>
           <w:sz w:val="23"/>
         </w:rPr>
-        <w:t>Le tier 3, les données : PostgreSQL 15 pour le stockage persistant, Redis 7 pour le cache et les sessions.</w:t>
+        <w:t>Docker et AWS pour l'infrastructure : le conteneur garantit un comportement identique en développement et en production. Pas Kubernetes, surdimensionné pour un MVP.</w:t>
       </w:r>
+    </w:p>
+    <w:p>
+      <w:pPr>
+        <w:spacing w:after="40" w:before="280"/>
+      </w:pPr>
+      <w:r>
+        <w:rPr>
+          <w:rFonts w:ascii="Cambria" w:hAnsi="Cambria"/>
+          <w:b/>
+          <w:i w:val="0"/>
+          <w:color w:val="2C5F2D"/>
+          <w:sz w:val="34"/>
+        </w:rPr>
+        <w:t>Diapositive 9 — Interface de programmation</w:t>
+      </w:r>
+    </w:p>
+    <w:p>
+      <w:pPr>
+        <w:spacing w:after="80"/>
+      </w:pPr>
+      <w:r>
+        <w:rPr>
+          <w:rFonts w:ascii="Calibri" w:hAnsi="Calibri"/>
+          <w:b/>
+          <w:color w:val="2C5F2D"/>
+          <w:sz w:val="21"/>
+        </w:rPr>
+        <w:t xml:space="preserve">Durée : </w:t>
+      </w:r>
+      <w:r>
+        <w:rPr>
+          <w:rFonts w:ascii="Calibri" w:hAnsi="Calibri"/>
+          <w:color w:val="2B2B2B"/>
+          <w:sz w:val="21"/>
+        </w:rPr>
+        <w:t>25 secondes</w:t>
+      </w:r>
+    </w:p>
+    <w:p>
+      <w:pPr>
+        <w:spacing w:after="80"/>
+      </w:pPr>
+      <w:r>
+        <w:rPr>
+          <w:rFonts w:ascii="Calibri" w:hAnsi="Calibri"/>
+          <w:b/>
+          <w:color w:val="2C5F2D"/>
+          <w:sz w:val="21"/>
+        </w:rPr>
+        <w:t xml:space="preserve">À l'écran : </w:t>
+      </w:r>
+      <w:r>
+        <w:rPr>
+          <w:rFonts w:ascii="Calibri" w:hAnsi="Calibri"/>
+          <w:color w:val="2B2B2B"/>
+          <w:sz w:val="21"/>
+        </w:rPr>
+        <w:t>Dix-huit endpoints répartis en quatre familles.</w:t>
+      </w:r>
+    </w:p>
+    <w:p>
+      <w:pPr>
+        <w:spacing w:after="40" w:before="0"/>
+      </w:pPr>
     </w:p>
     <w:p>
       <w:pPr>
@@ -1148,7 +1460,7 @@
           <w:color w:val="2B2B2B"/>
           <w:sz w:val="23"/>
         </w:rPr>
-        <w:t>Le tier 4, les services externes : OpenCV pour l'analyse d'image et Open-Meteo pour la météo.</w:t>
+        <w:t>L'API expose dix-huit endpoints, en quatre familles : l'authentification, la gestion des parcelles, les capteurs et le diagnostic avec son suivi.</w:t>
       </w:r>
     </w:p>
     <w:p>
@@ -1163,7 +1475,7 @@
           <w:color w:val="2B2B2B"/>
           <w:sz w:val="23"/>
         </w:rPr>
-        <w:t>Le flux est simple : la photo part du frontend vers l'API, elle est analysée par OpenCV, le résultat est écrit en base, puis renvoyé au navigateur en JSON.</w:t>
+        <w:t>Tout est testable en direct via Swagger, à l'adresse slash docs.</w:t>
       </w:r>
     </w:p>
     <w:p>
@@ -1178,7 +1490,571 @@
           <w:color w:val="2C5F2D"/>
           <w:sz w:val="34"/>
         </w:rPr>
-        <w:t>Diapositive 7 — Technologies imposées</w:t>
+        <w:t>Diapositive 10 — Intelligence artificielle</w:t>
+      </w:r>
+    </w:p>
+    <w:p>
+      <w:pPr>
+        <w:spacing w:after="80"/>
+      </w:pPr>
+      <w:r>
+        <w:rPr>
+          <w:rFonts w:ascii="Calibri" w:hAnsi="Calibri"/>
+          <w:b/>
+          <w:color w:val="2C5F2D"/>
+          <w:sz w:val="21"/>
+        </w:rPr>
+        <w:t xml:space="preserve">Durée : </w:t>
+      </w:r>
+      <w:r>
+        <w:rPr>
+          <w:rFonts w:ascii="Calibri" w:hAnsi="Calibri"/>
+          <w:color w:val="2B2B2B"/>
+          <w:sz w:val="21"/>
+        </w:rPr>
+        <w:t>1 min 05</w:t>
+      </w:r>
+    </w:p>
+    <w:p>
+      <w:pPr>
+        <w:spacing w:after="80"/>
+      </w:pPr>
+      <w:r>
+        <w:rPr>
+          <w:rFonts w:ascii="Calibri" w:hAnsi="Calibri"/>
+          <w:b/>
+          <w:color w:val="2C5F2D"/>
+          <w:sz w:val="21"/>
+        </w:rPr>
+        <w:t xml:space="preserve">À l'écran : </w:t>
+      </w:r>
+      <w:r>
+        <w:rPr>
+          <w:rFonts w:ascii="Calibri" w:hAnsi="Calibri"/>
+          <w:color w:val="2B2B2B"/>
+          <w:sz w:val="21"/>
+        </w:rPr>
+        <w:t>Trois chiffres clés puis la chaîne de traitement en quatre étapes.</w:t>
+      </w:r>
+    </w:p>
+    <w:p>
+      <w:pPr>
+        <w:spacing w:after="40" w:before="0"/>
+      </w:pPr>
+    </w:p>
+    <w:p>
+      <w:pPr>
+        <w:spacing w:after="160" w:before="0"/>
+      </w:pPr>
+      <w:r>
+        <w:rPr>
+          <w:rFonts w:ascii="Calibri" w:hAnsi="Calibri"/>
+          <w:b w:val="0"/>
+          <w:i w:val="0"/>
+          <w:color w:val="2B2B2B"/>
+          <w:sz w:val="23"/>
+        </w:rPr>
+        <w:t>L'intelligence artificielle utilise OpenCV et NumPy, les outils standards de la vision par ordinateur en Python.</w:t>
+      </w:r>
+    </w:p>
+    <w:p>
+      <w:pPr>
+        <w:spacing w:after="160" w:before="0"/>
+      </w:pPr>
+      <w:r>
+        <w:rPr>
+          <w:rFonts w:ascii="Calibri" w:hAnsi="Calibri"/>
+          <w:b w:val="0"/>
+          <w:i w:val="0"/>
+          <w:color w:val="2B2B2B"/>
+          <w:sz w:val="23"/>
+        </w:rPr>
+        <w:t>On reçoit la photo, OpenCV lit la couleur, la saturation, le contraste et la texture, on confronte ces caractéristiques aux signatures des cinq maladies connues, et on retourne la plus probable avec un indice de confiance.</w:t>
+      </w:r>
+    </w:p>
+    <w:p>
+      <w:pPr>
+        <w:spacing w:after="160" w:before="0"/>
+      </w:pPr>
+      <w:r>
+        <w:rPr>
+          <w:rFonts w:ascii="Calibri" w:hAnsi="Calibri"/>
+          <w:b w:val="0"/>
+          <w:i w:val="0"/>
+          <w:color w:val="2B2B2B"/>
+          <w:sz w:val="23"/>
+        </w:rPr>
+        <w:t>87 % de précision, au-dessus des 85 % demandés, en une seconde et demie.</w:t>
+      </w:r>
+    </w:p>
+    <w:p>
+      <w:pPr>
+        <w:spacing w:after="40" w:before="280"/>
+      </w:pPr>
+      <w:r>
+        <w:rPr>
+          <w:rFonts w:ascii="Cambria" w:hAnsi="Cambria"/>
+          <w:b/>
+          <w:i w:val="0"/>
+          <w:color w:val="2C5F2D"/>
+          <w:sz w:val="34"/>
+        </w:rPr>
+        <w:t>Diapositive 11 — Sécurité</w:t>
+      </w:r>
+    </w:p>
+    <w:p>
+      <w:pPr>
+        <w:spacing w:after="80"/>
+      </w:pPr>
+      <w:r>
+        <w:rPr>
+          <w:rFonts w:ascii="Calibri" w:hAnsi="Calibri"/>
+          <w:b/>
+          <w:color w:val="2C5F2D"/>
+          <w:sz w:val="21"/>
+        </w:rPr>
+        <w:t xml:space="preserve">Durée : </w:t>
+      </w:r>
+      <w:r>
+        <w:rPr>
+          <w:rFonts w:ascii="Calibri" w:hAnsi="Calibri"/>
+          <w:color w:val="2B2B2B"/>
+          <w:sz w:val="21"/>
+        </w:rPr>
+        <w:t>40 secondes</w:t>
+      </w:r>
+    </w:p>
+    <w:p>
+      <w:pPr>
+        <w:spacing w:after="80"/>
+      </w:pPr>
+      <w:r>
+        <w:rPr>
+          <w:rFonts w:ascii="Calibri" w:hAnsi="Calibri"/>
+          <w:b/>
+          <w:color w:val="2C5F2D"/>
+          <w:sz w:val="21"/>
+        </w:rPr>
+        <w:t xml:space="preserve">À l'écran : </w:t>
+      </w:r>
+      <w:r>
+        <w:rPr>
+          <w:rFonts w:ascii="Calibri" w:hAnsi="Calibri"/>
+          <w:color w:val="2B2B2B"/>
+          <w:sz w:val="21"/>
+        </w:rPr>
+        <w:t>Six couches de protection.</w:t>
+      </w:r>
+    </w:p>
+    <w:p>
+      <w:pPr>
+        <w:spacing w:after="40" w:before="0"/>
+      </w:pPr>
+    </w:p>
+    <w:p>
+      <w:pPr>
+        <w:spacing w:after="160" w:before="0"/>
+      </w:pPr>
+      <w:r>
+        <w:rPr>
+          <w:rFonts w:ascii="Calibri" w:hAnsi="Calibri"/>
+          <w:b w:val="0"/>
+          <w:i w:val="0"/>
+          <w:color w:val="2B2B2B"/>
+          <w:sz w:val="23"/>
+        </w:rPr>
+        <w:t>Six couches de sécurité : jetons JWT valables trente jours sans session côté serveur, mots de passe hachés avec Bcrypt et sel, validation Pydantic de toute donnée entrante — y compris les trames des capteurs — CORS configuré, HTTPS prêt via Let's Encrypt, et isolation des données par utilisateur.</w:t>
+      </w:r>
+    </w:p>
+    <w:p>
+      <w:pPr>
+        <w:spacing w:after="40" w:before="280"/>
+      </w:pPr>
+      <w:r>
+        <w:rPr>
+          <w:rFonts w:ascii="Cambria" w:hAnsi="Cambria"/>
+          <w:b/>
+          <w:i w:val="0"/>
+          <w:color w:val="2C5F2D"/>
+          <w:sz w:val="34"/>
+        </w:rPr>
+        <w:t>Diapositive 12 — Déploiement</w:t>
+      </w:r>
+    </w:p>
+    <w:p>
+      <w:pPr>
+        <w:spacing w:after="80"/>
+      </w:pPr>
+      <w:r>
+        <w:rPr>
+          <w:rFonts w:ascii="Calibri" w:hAnsi="Calibri"/>
+          <w:b/>
+          <w:color w:val="2C5F2D"/>
+          <w:sz w:val="21"/>
+        </w:rPr>
+        <w:t xml:space="preserve">Durée : </w:t>
+      </w:r>
+      <w:r>
+        <w:rPr>
+          <w:rFonts w:ascii="Calibri" w:hAnsi="Calibri"/>
+          <w:color w:val="2B2B2B"/>
+          <w:sz w:val="21"/>
+        </w:rPr>
+        <w:t>50 secondes</w:t>
+      </w:r>
+    </w:p>
+    <w:p>
+      <w:pPr>
+        <w:spacing w:after="80"/>
+      </w:pPr>
+      <w:r>
+        <w:rPr>
+          <w:rFonts w:ascii="Calibri" w:hAnsi="Calibri"/>
+          <w:b/>
+          <w:color w:val="2C5F2D"/>
+          <w:sz w:val="21"/>
+        </w:rPr>
+        <w:t xml:space="preserve">À l'écran : </w:t>
+      </w:r>
+      <w:r>
+        <w:rPr>
+          <w:rFonts w:ascii="Calibri" w:hAnsi="Calibri"/>
+          <w:color w:val="2B2B2B"/>
+          <w:sz w:val="21"/>
+        </w:rPr>
+        <w:t>Caractéristiques de l'instance à gauche, conteneurs Docker à droite.</w:t>
+      </w:r>
+    </w:p>
+    <w:p>
+      <w:pPr>
+        <w:spacing w:after="40" w:before="0"/>
+      </w:pPr>
+    </w:p>
+    <w:p>
+      <w:pPr>
+        <w:spacing w:after="160" w:before="0"/>
+      </w:pPr>
+      <w:r>
+        <w:rPr>
+          <w:rFonts w:ascii="Calibri" w:hAnsi="Calibri"/>
+          <w:b w:val="0"/>
+          <w:i w:val="0"/>
+          <w:color w:val="2B2B2B"/>
+          <w:sz w:val="23"/>
+        </w:rPr>
+        <w:t>Une instance AWS EC2 t2.micro sous Ubuntu, adresse IP publique, disponible en continu, gratuite pendant douze mois.</w:t>
+      </w:r>
+    </w:p>
+    <w:p>
+      <w:pPr>
+        <w:spacing w:after="160" w:before="0"/>
+      </w:pPr>
+      <w:r>
+        <w:rPr>
+          <w:rFonts w:ascii="Calibri" w:hAnsi="Calibri"/>
+          <w:b w:val="0"/>
+          <w:i w:val="0"/>
+          <w:color w:val="2B2B2B"/>
+          <w:sz w:val="23"/>
+        </w:rPr>
+        <w:t>Elle exécute quatre conteneurs Docker : l'API, PostgreSQL, Redis et le simulateur de capteurs. Les volumes sont persistants, les données survivent à tout redémarrage.</w:t>
+      </w:r>
+    </w:p>
+    <w:p>
+      <w:pPr>
+        <w:spacing w:after="160" w:before="0"/>
+      </w:pPr>
+      <w:r>
+        <w:rPr>
+          <w:rFonts w:ascii="Calibri" w:hAnsi="Calibri"/>
+          <w:b w:val="0"/>
+          <w:i w:val="0"/>
+          <w:color w:val="2B2B2B"/>
+          <w:sz w:val="23"/>
+        </w:rPr>
+        <w:t>C'est de la production, pas une démonstration sur un ordinateur portable.</w:t>
+      </w:r>
+    </w:p>
+    <w:p>
+      <w:pPr>
+        <w:spacing w:after="40" w:before="280"/>
+      </w:pPr>
+      <w:r>
+        <w:rPr>
+          <w:rFonts w:ascii="Cambria" w:hAnsi="Cambria"/>
+          <w:b/>
+          <w:i w:val="0"/>
+          <w:color w:val="2C5F2D"/>
+          <w:sz w:val="34"/>
+        </w:rPr>
+        <w:t>Diapositive 13 — Résultats mesurés</w:t>
+      </w:r>
+    </w:p>
+    <w:p>
+      <w:pPr>
+        <w:spacing w:after="80"/>
+      </w:pPr>
+      <w:r>
+        <w:rPr>
+          <w:rFonts w:ascii="Calibri" w:hAnsi="Calibri"/>
+          <w:b/>
+          <w:color w:val="2C5F2D"/>
+          <w:sz w:val="21"/>
+        </w:rPr>
+        <w:t xml:space="preserve">Durée : </w:t>
+      </w:r>
+      <w:r>
+        <w:rPr>
+          <w:rFonts w:ascii="Calibri" w:hAnsi="Calibri"/>
+          <w:color w:val="2B2B2B"/>
+          <w:sz w:val="21"/>
+        </w:rPr>
+        <w:t>40 secondes</w:t>
+      </w:r>
+    </w:p>
+    <w:p>
+      <w:pPr>
+        <w:spacing w:after="80"/>
+      </w:pPr>
+      <w:r>
+        <w:rPr>
+          <w:rFonts w:ascii="Calibri" w:hAnsi="Calibri"/>
+          <w:b/>
+          <w:color w:val="2C5F2D"/>
+          <w:sz w:val="21"/>
+        </w:rPr>
+        <w:t xml:space="preserve">À l'écran : </w:t>
+      </w:r>
+      <w:r>
+        <w:rPr>
+          <w:rFonts w:ascii="Calibri" w:hAnsi="Calibri"/>
+          <w:color w:val="2B2B2B"/>
+          <w:sz w:val="21"/>
+        </w:rPr>
+        <w:t>Quatre chiffres clés puis le tableau comparatif cible / réalisé.</w:t>
+      </w:r>
+    </w:p>
+    <w:p>
+      <w:pPr>
+        <w:spacing w:after="40" w:before="0"/>
+      </w:pPr>
+    </w:p>
+    <w:p>
+      <w:pPr>
+        <w:spacing w:after="160" w:before="0"/>
+      </w:pPr>
+      <w:r>
+        <w:rPr>
+          <w:rFonts w:ascii="Calibri" w:hAnsi="Calibri"/>
+          <w:b w:val="0"/>
+          <w:i w:val="0"/>
+          <w:color w:val="2B2B2B"/>
+          <w:sz w:val="23"/>
+        </w:rPr>
+        <w:t>Face aux objectifs : dix-huit endpoints livrés pour cinq demandés. Une seconde et demie de temps de réponse contre moins de deux exigées. 87 % de précision contre 85 demandés. Un relevé par minute et par capteur, soit une surveillance continue.</w:t>
+      </w:r>
+    </w:p>
+    <w:p>
+      <w:pPr>
+        <w:spacing w:after="160" w:before="0"/>
+      </w:pPr>
+      <w:r>
+        <w:rPr>
+          <w:rFonts w:ascii="Calibri" w:hAnsi="Calibri"/>
+          <w:b w:val="0"/>
+          <w:i w:val="0"/>
+          <w:color w:val="2B2B2B"/>
+          <w:sz w:val="23"/>
+        </w:rPr>
+        <w:t>Chaque critère mesurable est atteint ou dépassé.</w:t>
+      </w:r>
+    </w:p>
+    <w:p>
+      <w:pPr>
+        <w:spacing w:after="40" w:before="280"/>
+      </w:pPr>
+      <w:r>
+        <w:rPr>
+          <w:rFonts w:ascii="Cambria" w:hAnsi="Cambria"/>
+          <w:b/>
+          <w:i w:val="0"/>
+          <w:color w:val="2C5F2D"/>
+          <w:sz w:val="34"/>
+        </w:rPr>
+        <w:t>Diapositive 14 — Compétences Bachelor 2</w:t>
+      </w:r>
+    </w:p>
+    <w:p>
+      <w:pPr>
+        <w:spacing w:after="80"/>
+      </w:pPr>
+      <w:r>
+        <w:rPr>
+          <w:rFonts w:ascii="Calibri" w:hAnsi="Calibri"/>
+          <w:b/>
+          <w:color w:val="2C5F2D"/>
+          <w:sz w:val="21"/>
+        </w:rPr>
+        <w:t xml:space="preserve">Durée : </w:t>
+      </w:r>
+      <w:r>
+        <w:rPr>
+          <w:rFonts w:ascii="Calibri" w:hAnsi="Calibri"/>
+          <w:color w:val="2B2B2B"/>
+          <w:sz w:val="21"/>
+        </w:rPr>
+        <w:t>25 secondes</w:t>
+      </w:r>
+    </w:p>
+    <w:p>
+      <w:pPr>
+        <w:spacing w:after="80"/>
+      </w:pPr>
+      <w:r>
+        <w:rPr>
+          <w:rFonts w:ascii="Calibri" w:hAnsi="Calibri"/>
+          <w:b/>
+          <w:color w:val="2C5F2D"/>
+          <w:sz w:val="21"/>
+        </w:rPr>
+        <w:t xml:space="preserve">À l'écran : </w:t>
+      </w:r>
+      <w:r>
+        <w:rPr>
+          <w:rFonts w:ascii="Calibri" w:hAnsi="Calibri"/>
+          <w:color w:val="2B2B2B"/>
+          <w:sz w:val="21"/>
+        </w:rPr>
+        <w:t>Les cinq domaines couverts, numérotés.</w:t>
+      </w:r>
+    </w:p>
+    <w:p>
+      <w:pPr>
+        <w:spacing w:after="40" w:before="0"/>
+      </w:pPr>
+    </w:p>
+    <w:p>
+      <w:pPr>
+        <w:spacing w:after="160" w:before="0"/>
+      </w:pPr>
+      <w:r>
+        <w:rPr>
+          <w:rFonts w:ascii="Calibri" w:hAnsi="Calibri"/>
+          <w:b w:val="0"/>
+          <w:i w:val="0"/>
+          <w:color w:val="2B2B2B"/>
+          <w:sz w:val="23"/>
+        </w:rPr>
+        <w:t>Ce projet couvre les cinq domaines du Bachelor 2 : l'intelligence artificielle, le développement backend, le développement frontend, les bases de données, et le réseau avec l'IoT et le cloud.</w:t>
+      </w:r>
+    </w:p>
+    <w:p>
+      <w:pPr>
+        <w:spacing w:after="40" w:before="280"/>
+      </w:pPr>
+      <w:r>
+        <w:rPr>
+          <w:rFonts w:ascii="Cambria" w:hAnsi="Cambria"/>
+          <w:b/>
+          <w:i w:val="0"/>
+          <w:color w:val="2C5F2D"/>
+          <w:sz w:val="34"/>
+        </w:rPr>
+        <w:t>Diapositive 15 — Conclusion</w:t>
+      </w:r>
+    </w:p>
+    <w:p>
+      <w:pPr>
+        <w:spacing w:after="80"/>
+      </w:pPr>
+      <w:r>
+        <w:rPr>
+          <w:rFonts w:ascii="Calibri" w:hAnsi="Calibri"/>
+          <w:b/>
+          <w:color w:val="2C5F2D"/>
+          <w:sz w:val="21"/>
+        </w:rPr>
+        <w:t xml:space="preserve">Durée : </w:t>
+      </w:r>
+      <w:r>
+        <w:rPr>
+          <w:rFonts w:ascii="Calibri" w:hAnsi="Calibri"/>
+          <w:color w:val="2B2B2B"/>
+          <w:sz w:val="21"/>
+        </w:rPr>
+        <w:t>30 secondes</w:t>
+      </w:r>
+    </w:p>
+    <w:p>
+      <w:pPr>
+        <w:spacing w:after="80"/>
+      </w:pPr>
+      <w:r>
+        <w:rPr>
+          <w:rFonts w:ascii="Calibri" w:hAnsi="Calibri"/>
+          <w:b/>
+          <w:color w:val="2C5F2D"/>
+          <w:sz w:val="21"/>
+        </w:rPr>
+        <w:t xml:space="preserve">À l'écran : </w:t>
+      </w:r>
+      <w:r>
+        <w:rPr>
+          <w:rFonts w:ascii="Calibri" w:hAnsi="Calibri"/>
+          <w:color w:val="2B2B2B"/>
+          <w:sz w:val="21"/>
+        </w:rPr>
+        <w:t>Quatre qualités du projet et une phrase de synthèse.</w:t>
+      </w:r>
+    </w:p>
+    <w:p>
+      <w:pPr>
+        <w:spacing w:after="40" w:before="0"/>
+      </w:pPr>
+    </w:p>
+    <w:p>
+      <w:pPr>
+        <w:spacing w:after="160" w:before="0"/>
+      </w:pPr>
+      <w:r>
+        <w:rPr>
+          <w:rFonts w:ascii="Calibri" w:hAnsi="Calibri"/>
+          <w:b w:val="0"/>
+          <w:i w:val="0"/>
+          <w:color w:val="2B2B2B"/>
+          <w:sz w:val="23"/>
+        </w:rPr>
+        <w:t>PlantDiag est fonctionnel, conforme au cahier des charges, documenté et évolutif.</w:t>
+      </w:r>
+    </w:p>
+    <w:p>
+      <w:pPr>
+        <w:spacing w:after="160" w:before="0"/>
+      </w:pPr>
+      <w:r>
+        <w:rPr>
+          <w:rFonts w:ascii="Calibri" w:hAnsi="Calibri"/>
+          <w:b w:val="0"/>
+          <w:i w:val="0"/>
+          <w:color w:val="2B2B2B"/>
+          <w:sz w:val="23"/>
+        </w:rPr>
+        <w:t>Il est immédiatement utilisable par un agriculteur, depuis son téléphone, dans son champ.</w:t>
+      </w:r>
+    </w:p>
+    <w:p>
+      <w:pPr>
+        <w:spacing w:after="40" w:before="280"/>
+      </w:pPr>
+      <w:r>
+        <w:rPr>
+          <w:rFonts w:ascii="Cambria" w:hAnsi="Cambria"/>
+          <w:b/>
+          <w:i w:val="0"/>
+          <w:color w:val="2C5F2D"/>
+          <w:sz w:val="34"/>
+        </w:rPr>
+        <w:t>Diapositive 16 — Questions</w:t>
       </w:r>
     </w:p>
     <w:p>
@@ -1222,968 +2098,6 @@
           <w:color w:val="2B2B2B"/>
           <w:sz w:val="21"/>
         </w:rPr>
-        <w:t>Les trois technologies en colonnes, avec la justification de chacune.</w:t>
-      </w:r>
-    </w:p>
-    <w:p>
-      <w:pPr>
-        <w:spacing w:after="40" w:before="0"/>
-      </w:pPr>
-    </w:p>
-    <w:p>
-      <w:pPr>
-        <w:spacing w:after="160" w:before="0"/>
-      </w:pPr>
-      <w:r>
-        <w:rPr>
-          <w:rFonts w:ascii="Calibri" w:hAnsi="Calibri"/>
-          <w:b w:val="0"/>
-          <w:i w:val="0"/>
-          <w:color w:val="2B2B2B"/>
-          <w:sz w:val="23"/>
-        </w:rPr>
-        <w:t>Le cahier des charges imposait trois technologies.</w:t>
-      </w:r>
-    </w:p>
-    <w:p>
-      <w:pPr>
-        <w:spacing w:after="160" w:before="0"/>
-      </w:pPr>
-      <w:r>
-        <w:rPr>
-          <w:rFonts w:ascii="Calibri" w:hAnsi="Calibri"/>
-          <w:b w:val="0"/>
-          <w:i w:val="0"/>
-          <w:color w:val="2B2B2B"/>
-          <w:sz w:val="23"/>
-        </w:rPr>
-        <w:t>FastAPI pour le backend : framework asynchrone moderne, validation native, documentation automatique. Je n'ai pas pris Node.js parce que Python domine la vision par ordinateur — OpenCV et NumPy sont des bibliothèques Python.</w:t>
-      </w:r>
-    </w:p>
-    <w:p>
-      <w:pPr>
-        <w:spacing w:after="160" w:before="0"/>
-      </w:pPr>
-      <w:r>
-        <w:rPr>
-          <w:rFonts w:ascii="Calibri" w:hAnsi="Calibri"/>
-          <w:b w:val="0"/>
-          <w:i w:val="0"/>
-          <w:color w:val="2B2B2B"/>
-          <w:sz w:val="23"/>
-        </w:rPr>
-        <w:t>PostgreSQL pour les données : transactions ACID et modèle relationnel clair. Je n'ai pas pris MongoDB parce que les relations entre utilisateur, parcelle et diagnostic sont structurées.</w:t>
-      </w:r>
-    </w:p>
-    <w:p>
-      <w:pPr>
-        <w:spacing w:after="160" w:before="0"/>
-      </w:pPr>
-      <w:r>
-        <w:rPr>
-          <w:rFonts w:ascii="Calibri" w:hAnsi="Calibri"/>
-          <w:b w:val="0"/>
-          <w:i w:val="0"/>
-          <w:color w:val="2B2B2B"/>
-          <w:sz w:val="23"/>
-        </w:rPr>
-        <w:t>Docker et AWS pour l'infrastructure : le conteneur garantit que le code s'exécute à l'identique en développement et en production. Je n'ai pas pris Kubernetes, surdimensionné pour un MVP.</w:t>
-      </w:r>
-    </w:p>
-    <w:p>
-      <w:pPr>
-        <w:spacing w:after="160" w:before="0"/>
-      </w:pPr>
-      <w:r>
-        <w:rPr>
-          <w:rFonts w:ascii="Calibri" w:hAnsi="Calibri"/>
-          <w:b w:val="0"/>
-          <w:i w:val="0"/>
-          <w:color w:val="2B2B2B"/>
-          <w:sz w:val="23"/>
-        </w:rPr>
-        <w:t>Ces trois choix fonctionnent naturellement ensemble.</w:t>
-      </w:r>
-    </w:p>
-    <w:p>
-      <w:pPr>
-        <w:spacing w:after="40" w:before="280"/>
-      </w:pPr>
-      <w:r>
-        <w:rPr>
-          <w:rFonts w:ascii="Cambria" w:hAnsi="Cambria"/>
-          <w:b/>
-          <w:i w:val="0"/>
-          <w:color w:val="2C5F2D"/>
-          <w:sz w:val="34"/>
-        </w:rPr>
-        <w:t>Diapositive 8 — Interface de programmation</w:t>
-      </w:r>
-    </w:p>
-    <w:p>
-      <w:pPr>
-        <w:spacing w:after="80"/>
-      </w:pPr>
-      <w:r>
-        <w:rPr>
-          <w:rFonts w:ascii="Calibri" w:hAnsi="Calibri"/>
-          <w:b/>
-          <w:color w:val="2C5F2D"/>
-          <w:sz w:val="21"/>
-        </w:rPr>
-        <w:t xml:space="preserve">Durée : </w:t>
-      </w:r>
-      <w:r>
-        <w:rPr>
-          <w:rFonts w:ascii="Calibri" w:hAnsi="Calibri"/>
-          <w:color w:val="2B2B2B"/>
-          <w:sz w:val="21"/>
-        </w:rPr>
-        <w:t>30 secondes</w:t>
-      </w:r>
-    </w:p>
-    <w:p>
-      <w:pPr>
-        <w:spacing w:after="80"/>
-      </w:pPr>
-      <w:r>
-        <w:rPr>
-          <w:rFonts w:ascii="Calibri" w:hAnsi="Calibri"/>
-          <w:b/>
-          <w:color w:val="2C5F2D"/>
-          <w:sz w:val="21"/>
-        </w:rPr>
-        <w:t xml:space="preserve">À l'écran : </w:t>
-      </w:r>
-      <w:r>
-        <w:rPr>
-          <w:rFonts w:ascii="Calibri" w:hAnsi="Calibri"/>
-          <w:color w:val="2B2B2B"/>
-          <w:sz w:val="21"/>
-        </w:rPr>
-        <w:t>Les huit endpoints répartis en trois groupes.</w:t>
-      </w:r>
-    </w:p>
-    <w:p>
-      <w:pPr>
-        <w:spacing w:after="40" w:before="0"/>
-      </w:pPr>
-    </w:p>
-    <w:p>
-      <w:pPr>
-        <w:spacing w:after="160" w:before="0"/>
-      </w:pPr>
-      <w:r>
-        <w:rPr>
-          <w:rFonts w:ascii="Calibri" w:hAnsi="Calibri"/>
-          <w:b w:val="0"/>
-          <w:i w:val="0"/>
-          <w:color w:val="2B2B2B"/>
-          <w:sz w:val="23"/>
-        </w:rPr>
-        <w:t>L'API expose huit endpoints : trois pour l'authentification, trois pour l'application, deux pour la documentation et l'interface.</w:t>
-      </w:r>
-    </w:p>
-    <w:p>
-      <w:pPr>
-        <w:spacing w:after="160" w:before="0"/>
-      </w:pPr>
-      <w:r>
-        <w:rPr>
-          <w:rFonts w:ascii="Calibri" w:hAnsi="Calibri"/>
-          <w:b w:val="0"/>
-          <w:i w:val="0"/>
-          <w:color w:val="2B2B2B"/>
-          <w:sz w:val="23"/>
-        </w:rPr>
-        <w:t>Tout est consultable et testable en direct via Swagger, à l'adresse slash docs.</w:t>
-      </w:r>
-    </w:p>
-    <w:p>
-      <w:pPr>
-        <w:spacing w:after="40" w:before="280"/>
-      </w:pPr>
-      <w:r>
-        <w:rPr>
-          <w:rFonts w:ascii="Cambria" w:hAnsi="Cambria"/>
-          <w:b/>
-          <w:i w:val="0"/>
-          <w:color w:val="2C5F2D"/>
-          <w:sz w:val="34"/>
-        </w:rPr>
-        <w:t>Diapositive 9 — Intelligence artificielle</w:t>
-      </w:r>
-    </w:p>
-    <w:p>
-      <w:pPr>
-        <w:spacing w:after="80"/>
-      </w:pPr>
-      <w:r>
-        <w:rPr>
-          <w:rFonts w:ascii="Calibri" w:hAnsi="Calibri"/>
-          <w:b/>
-          <w:color w:val="2C5F2D"/>
-          <w:sz w:val="21"/>
-        </w:rPr>
-        <w:t xml:space="preserve">Durée : </w:t>
-      </w:r>
-      <w:r>
-        <w:rPr>
-          <w:rFonts w:ascii="Calibri" w:hAnsi="Calibri"/>
-          <w:color w:val="2B2B2B"/>
-          <w:sz w:val="21"/>
-        </w:rPr>
-        <w:t>1 min 30</w:t>
-      </w:r>
-    </w:p>
-    <w:p>
-      <w:pPr>
-        <w:spacing w:after="80"/>
-      </w:pPr>
-      <w:r>
-        <w:rPr>
-          <w:rFonts w:ascii="Calibri" w:hAnsi="Calibri"/>
-          <w:b/>
-          <w:color w:val="2C5F2D"/>
-          <w:sz w:val="21"/>
-        </w:rPr>
-        <w:t xml:space="preserve">À l'écran : </w:t>
-      </w:r>
-      <w:r>
-        <w:rPr>
-          <w:rFonts w:ascii="Calibri" w:hAnsi="Calibri"/>
-          <w:color w:val="2B2B2B"/>
-          <w:sz w:val="21"/>
-        </w:rPr>
-        <w:t>Trois chiffres clés puis la chaîne de traitement en quatre étapes.</w:t>
-      </w:r>
-    </w:p>
-    <w:p>
-      <w:pPr>
-        <w:spacing w:after="40" w:before="0"/>
-      </w:pPr>
-    </w:p>
-    <w:p>
-      <w:pPr>
-        <w:spacing w:after="160" w:before="0"/>
-      </w:pPr>
-      <w:r>
-        <w:rPr>
-          <w:rFonts w:ascii="Calibri" w:hAnsi="Calibri"/>
-          <w:b w:val="0"/>
-          <w:i w:val="0"/>
-          <w:color w:val="2B2B2B"/>
-          <w:sz w:val="23"/>
-        </w:rPr>
-        <w:t>L'intelligence artificielle, c'est le cœur technique du projet. J'utilise OpenCV et NumPy, les outils standards de la vision par ordinateur en Python.</w:t>
-      </w:r>
-    </w:p>
-    <w:p>
-      <w:pPr>
-        <w:spacing w:after="160" w:before="0"/>
-      </w:pPr>
-      <w:r>
-        <w:rPr>
-          <w:rFonts w:ascii="Calibri" w:hAnsi="Calibri"/>
-          <w:b w:val="0"/>
-          <w:i w:val="0"/>
-          <w:color w:val="2B2B2B"/>
-          <w:sz w:val="23"/>
-        </w:rPr>
-        <w:t>Le fonctionnement : on reçoit la photo, OpenCV lit la couleur, la saturation, le contraste et la texture de la feuille, on confronte ces caractéristiques aux signatures des cinq maladies connues, et on retourne la plus probable avec un indice de confiance.</w:t>
-      </w:r>
-    </w:p>
-    <w:p>
-      <w:pPr>
-        <w:spacing w:after="160" w:before="0"/>
-      </w:pPr>
-      <w:r>
-        <w:rPr>
-          <w:rFonts w:ascii="Calibri" w:hAnsi="Calibri"/>
-          <w:b w:val="0"/>
-          <w:i w:val="0"/>
-          <w:color w:val="2B2B2B"/>
-          <w:sz w:val="23"/>
-        </w:rPr>
-        <w:t>Le résultat : 87 % de précision, au-dessus des 85 % demandés, en une seconde et demie, sous les deux secondes exigées.</w:t>
-      </w:r>
-    </w:p>
-    <w:p>
-      <w:pPr>
-        <w:spacing w:after="160" w:before="0"/>
-      </w:pPr>
-      <w:r>
-        <w:rPr>
-          <w:rFonts w:ascii="Calibri" w:hAnsi="Calibri"/>
-          <w:b w:val="0"/>
-          <w:i w:val="0"/>
-          <w:color w:val="2B2B2B"/>
-          <w:sz w:val="23"/>
-        </w:rPr>
-        <w:t>Les maladies couvertes sont le mildiou, l'oïdium, la rouille, la brûlure des feuilles et la tache noire, plus la classe « feuille saine ».</w:t>
-      </w:r>
-    </w:p>
-    <w:p>
-      <w:pPr>
-        <w:spacing w:after="40" w:before="280"/>
-      </w:pPr>
-      <w:r>
-        <w:rPr>
-          <w:rFonts w:ascii="Cambria" w:hAnsi="Cambria"/>
-          <w:b/>
-          <w:i w:val="0"/>
-          <w:color w:val="2C5F2D"/>
-          <w:sz w:val="34"/>
-        </w:rPr>
-        <w:t>Diapositive 10 — Sécurité</w:t>
-      </w:r>
-    </w:p>
-    <w:p>
-      <w:pPr>
-        <w:spacing w:after="80"/>
-      </w:pPr>
-      <w:r>
-        <w:rPr>
-          <w:rFonts w:ascii="Calibri" w:hAnsi="Calibri"/>
-          <w:b/>
-          <w:color w:val="2C5F2D"/>
-          <w:sz w:val="21"/>
-        </w:rPr>
-        <w:t xml:space="preserve">Durée : </w:t>
-      </w:r>
-      <w:r>
-        <w:rPr>
-          <w:rFonts w:ascii="Calibri" w:hAnsi="Calibri"/>
-          <w:color w:val="2B2B2B"/>
-          <w:sz w:val="21"/>
-        </w:rPr>
-        <w:t>1 minute</w:t>
-      </w:r>
-    </w:p>
-    <w:p>
-      <w:pPr>
-        <w:spacing w:after="80"/>
-      </w:pPr>
-      <w:r>
-        <w:rPr>
-          <w:rFonts w:ascii="Calibri" w:hAnsi="Calibri"/>
-          <w:b/>
-          <w:color w:val="2C5F2D"/>
-          <w:sz w:val="21"/>
-        </w:rPr>
-        <w:t xml:space="preserve">À l'écran : </w:t>
-      </w:r>
-      <w:r>
-        <w:rPr>
-          <w:rFonts w:ascii="Calibri" w:hAnsi="Calibri"/>
-          <w:color w:val="2B2B2B"/>
-          <w:sz w:val="21"/>
-        </w:rPr>
-        <w:t>Six couches de protection.</w:t>
-      </w:r>
-    </w:p>
-    <w:p>
-      <w:pPr>
-        <w:spacing w:after="40" w:before="0"/>
-      </w:pPr>
-    </w:p>
-    <w:p>
-      <w:pPr>
-        <w:spacing w:after="160" w:before="0"/>
-      </w:pPr>
-      <w:r>
-        <w:rPr>
-          <w:rFonts w:ascii="Calibri" w:hAnsi="Calibri"/>
-          <w:b w:val="0"/>
-          <w:i w:val="0"/>
-          <w:color w:val="2B2B2B"/>
-          <w:sz w:val="23"/>
-        </w:rPr>
-        <w:t>La sécurité repose sur six couches.</w:t>
-      </w:r>
-    </w:p>
-    <w:p>
-      <w:pPr>
-        <w:spacing w:after="160" w:before="0"/>
-      </w:pPr>
-      <w:r>
-        <w:rPr>
-          <w:rFonts w:ascii="Calibri" w:hAnsi="Calibri"/>
-          <w:b w:val="0"/>
-          <w:i w:val="0"/>
-          <w:color w:val="2B2B2B"/>
-          <w:sz w:val="23"/>
-        </w:rPr>
-        <w:t>Les jetons JWT : chaque utilisateur reçoit un jeton signé valable trente jours, sans session côté serveur, ce qui reste scalable.</w:t>
-      </w:r>
-    </w:p>
-    <w:p>
-      <w:pPr>
-        <w:spacing w:after="160" w:before="0"/>
-      </w:pPr>
-      <w:r>
-        <w:rPr>
-          <w:rFonts w:ascii="Calibri" w:hAnsi="Calibri"/>
-          <w:b w:val="0"/>
-          <w:i w:val="0"/>
-          <w:color w:val="2B2B2B"/>
-          <w:sz w:val="23"/>
-        </w:rPr>
-        <w:t>Le hachage Bcrypt avec sel : les mots de passe sont irrécupérables, même si la base fuitait.</w:t>
-      </w:r>
-    </w:p>
-    <w:p>
-      <w:pPr>
-        <w:spacing w:after="160" w:before="0"/>
-      </w:pPr>
-      <w:r>
-        <w:rPr>
-          <w:rFonts w:ascii="Calibri" w:hAnsi="Calibri"/>
-          <w:b w:val="0"/>
-          <w:i w:val="0"/>
-          <w:color w:val="2B2B2B"/>
-          <w:sz w:val="23"/>
-        </w:rPr>
-        <w:t>La validation Pydantic : toute donnée entrante est typée et contrôlée avant d'atteindre la base.</w:t>
-      </w:r>
-    </w:p>
-    <w:p>
-      <w:pPr>
-        <w:spacing w:after="160" w:before="0"/>
-      </w:pPr>
-      <w:r>
-        <w:rPr>
-          <w:rFonts w:ascii="Calibri" w:hAnsi="Calibri"/>
-          <w:b w:val="0"/>
-          <w:i w:val="0"/>
-          <w:color w:val="2B2B2B"/>
-          <w:sz w:val="23"/>
-        </w:rPr>
-        <w:t>Le CORS est configuré, le passage en HTTPS est prêt via Let's Encrypt, et chaque compte n'accède qu'à ses propres données.</w:t>
-      </w:r>
-    </w:p>
-    <w:p>
-      <w:pPr>
-        <w:spacing w:after="40" w:before="280"/>
-      </w:pPr>
-      <w:r>
-        <w:rPr>
-          <w:rFonts w:ascii="Cambria" w:hAnsi="Cambria"/>
-          <w:b/>
-          <w:i w:val="0"/>
-          <w:color w:val="2C5F2D"/>
-          <w:sz w:val="34"/>
-        </w:rPr>
-        <w:t>Diapositive 11 — Déploiement</w:t>
-      </w:r>
-    </w:p>
-    <w:p>
-      <w:pPr>
-        <w:spacing w:after="80"/>
-      </w:pPr>
-      <w:r>
-        <w:rPr>
-          <w:rFonts w:ascii="Calibri" w:hAnsi="Calibri"/>
-          <w:b/>
-          <w:color w:val="2C5F2D"/>
-          <w:sz w:val="21"/>
-        </w:rPr>
-        <w:t xml:space="preserve">Durée : </w:t>
-      </w:r>
-      <w:r>
-        <w:rPr>
-          <w:rFonts w:ascii="Calibri" w:hAnsi="Calibri"/>
-          <w:color w:val="2B2B2B"/>
-          <w:sz w:val="21"/>
-        </w:rPr>
-        <w:t>1 min 30</w:t>
-      </w:r>
-    </w:p>
-    <w:p>
-      <w:pPr>
-        <w:spacing w:after="80"/>
-      </w:pPr>
-      <w:r>
-        <w:rPr>
-          <w:rFonts w:ascii="Calibri" w:hAnsi="Calibri"/>
-          <w:b/>
-          <w:color w:val="2C5F2D"/>
-          <w:sz w:val="21"/>
-        </w:rPr>
-        <w:t xml:space="preserve">À l'écran : </w:t>
-      </w:r>
-      <w:r>
-        <w:rPr>
-          <w:rFonts w:ascii="Calibri" w:hAnsi="Calibri"/>
-          <w:color w:val="2B2B2B"/>
-          <w:sz w:val="21"/>
-        </w:rPr>
-        <w:t>Caractéristiques de l'instance à gauche, conteneurs Docker à droite.</w:t>
-      </w:r>
-    </w:p>
-    <w:p>
-      <w:pPr>
-        <w:spacing w:after="40" w:before="0"/>
-      </w:pPr>
-    </w:p>
-    <w:p>
-      <w:pPr>
-        <w:spacing w:after="160" w:before="0"/>
-      </w:pPr>
-      <w:r>
-        <w:rPr>
-          <w:rFonts w:ascii="Calibri" w:hAnsi="Calibri"/>
-          <w:b w:val="0"/>
-          <w:i w:val="0"/>
-          <w:color w:val="2B2B2B"/>
-          <w:sz w:val="23"/>
-        </w:rPr>
-        <w:t>Le déploiement : une instance AWS EC2 t2.micro sous Ubuntu Server, avec une adresse IP publique, disponible en continu et gratuite pendant douze mois.</w:t>
-      </w:r>
-    </w:p>
-    <w:p>
-      <w:pPr>
-        <w:spacing w:after="160" w:before="0"/>
-      </w:pPr>
-      <w:r>
-        <w:rPr>
-          <w:rFonts w:ascii="Calibri" w:hAnsi="Calibri"/>
-          <w:b w:val="0"/>
-          <w:i w:val="0"/>
-          <w:color w:val="2B2B2B"/>
-          <w:sz w:val="23"/>
-        </w:rPr>
-        <w:t>Cette instance exécute trois conteneurs Docker : l'API FastAPI sur le port 8000, PostgreSQL sur le 5432 et Redis sur le 6379.</w:t>
-      </w:r>
-    </w:p>
-    <w:p>
-      <w:pPr>
-        <w:spacing w:after="160" w:before="0"/>
-      </w:pPr>
-      <w:r>
-        <w:rPr>
-          <w:rFonts w:ascii="Calibri" w:hAnsi="Calibri"/>
-          <w:b w:val="0"/>
-          <w:i w:val="0"/>
-          <w:color w:val="2B2B2B"/>
-          <w:sz w:val="23"/>
-        </w:rPr>
-        <w:t>Les volumes sont persistants : les données survivent à tout redémarrage.</w:t>
-      </w:r>
-    </w:p>
-    <w:p>
-      <w:pPr>
-        <w:spacing w:after="160" w:before="0"/>
-      </w:pPr>
-      <w:r>
-        <w:rPr>
-          <w:rFonts w:ascii="Calibri" w:hAnsi="Calibri"/>
-          <w:b w:val="0"/>
-          <w:i w:val="0"/>
-          <w:color w:val="2B2B2B"/>
-          <w:sz w:val="23"/>
-        </w:rPr>
-        <w:t>C'est de la production, pas une démonstration sur un ordinateur portable.</w:t>
-      </w:r>
-    </w:p>
-    <w:p>
-      <w:pPr>
-        <w:spacing w:after="40" w:before="280"/>
-      </w:pPr>
-      <w:r>
-        <w:rPr>
-          <w:rFonts w:ascii="Cambria" w:hAnsi="Cambria"/>
-          <w:b/>
-          <w:i w:val="0"/>
-          <w:color w:val="2C5F2D"/>
-          <w:sz w:val="34"/>
-        </w:rPr>
-        <w:t>Diapositive 12 — Résultats mesurés</w:t>
-      </w:r>
-    </w:p>
-    <w:p>
-      <w:pPr>
-        <w:spacing w:after="80"/>
-      </w:pPr>
-      <w:r>
-        <w:rPr>
-          <w:rFonts w:ascii="Calibri" w:hAnsi="Calibri"/>
-          <w:b/>
-          <w:color w:val="2C5F2D"/>
-          <w:sz w:val="21"/>
-        </w:rPr>
-        <w:t xml:space="preserve">Durée : </w:t>
-      </w:r>
-      <w:r>
-        <w:rPr>
-          <w:rFonts w:ascii="Calibri" w:hAnsi="Calibri"/>
-          <w:color w:val="2B2B2B"/>
-          <w:sz w:val="21"/>
-        </w:rPr>
-        <w:t>1 minute</w:t>
-      </w:r>
-    </w:p>
-    <w:p>
-      <w:pPr>
-        <w:spacing w:after="80"/>
-      </w:pPr>
-      <w:r>
-        <w:rPr>
-          <w:rFonts w:ascii="Calibri" w:hAnsi="Calibri"/>
-          <w:b/>
-          <w:color w:val="2C5F2D"/>
-          <w:sz w:val="21"/>
-        </w:rPr>
-        <w:t xml:space="preserve">À l'écran : </w:t>
-      </w:r>
-      <w:r>
-        <w:rPr>
-          <w:rFonts w:ascii="Calibri" w:hAnsi="Calibri"/>
-          <w:color w:val="2B2B2B"/>
-          <w:sz w:val="21"/>
-        </w:rPr>
-        <w:t>Quatre chiffres clés puis le tableau comparatif cible / réalisé.</w:t>
-      </w:r>
-    </w:p>
-    <w:p>
-      <w:pPr>
-        <w:spacing w:after="40" w:before="0"/>
-      </w:pPr>
-    </w:p>
-    <w:p>
-      <w:pPr>
-        <w:spacing w:after="160" w:before="0"/>
-      </w:pPr>
-      <w:r>
-        <w:rPr>
-          <w:rFonts w:ascii="Calibri" w:hAnsi="Calibri"/>
-          <w:b w:val="0"/>
-          <w:i w:val="0"/>
-          <w:color w:val="2B2B2B"/>
-          <w:sz w:val="23"/>
-        </w:rPr>
-        <w:t>Voici les chiffres face aux objectifs.</w:t>
-      </w:r>
-    </w:p>
-    <w:p>
-      <w:pPr>
-        <w:spacing w:after="160" w:before="0"/>
-      </w:pPr>
-      <w:r>
-        <w:rPr>
-          <w:rFonts w:ascii="Calibri" w:hAnsi="Calibri"/>
-          <w:b w:val="0"/>
-          <w:i w:val="0"/>
-          <w:color w:val="2B2B2B"/>
-          <w:sz w:val="23"/>
-        </w:rPr>
-        <w:t>Huit endpoints livrés pour cinq demandés, soit 60 % de plus.</w:t>
-      </w:r>
-    </w:p>
-    <w:p>
-      <w:pPr>
-        <w:spacing w:after="160" w:before="0"/>
-      </w:pPr>
-      <w:r>
-        <w:rPr>
-          <w:rFonts w:ascii="Calibri" w:hAnsi="Calibri"/>
-          <w:b w:val="0"/>
-          <w:i w:val="0"/>
-          <w:color w:val="2B2B2B"/>
-          <w:sz w:val="23"/>
-        </w:rPr>
-        <w:t>Une seconde et demie de temps de réponse, contre moins de deux secondes exigées : 25 % de marge.</w:t>
-      </w:r>
-    </w:p>
-    <w:p>
-      <w:pPr>
-        <w:spacing w:after="160" w:before="0"/>
-      </w:pPr>
-      <w:r>
-        <w:rPr>
-          <w:rFonts w:ascii="Calibri" w:hAnsi="Calibri"/>
-          <w:b w:val="0"/>
-          <w:i w:val="0"/>
-          <w:color w:val="2B2B2B"/>
-          <w:sz w:val="23"/>
-        </w:rPr>
-        <w:t>87 % de précision contre 85 % demandés.</w:t>
-      </w:r>
-    </w:p>
-    <w:p>
-      <w:pPr>
-        <w:spacing w:after="160" w:before="0"/>
-      </w:pPr>
-      <w:r>
-        <w:rPr>
-          <w:rFonts w:ascii="Calibri" w:hAnsi="Calibri"/>
-          <w:b w:val="0"/>
-          <w:i w:val="0"/>
-          <w:color w:val="2B2B2B"/>
-          <w:sz w:val="23"/>
-        </w:rPr>
-        <w:t>Trois technologies imposées sur trois, documentation complète et déploiement cloud en ligne.</w:t>
-      </w:r>
-    </w:p>
-    <w:p>
-      <w:pPr>
-        <w:spacing w:after="160" w:before="0"/>
-      </w:pPr>
-      <w:r>
-        <w:rPr>
-          <w:rFonts w:ascii="Calibri" w:hAnsi="Calibri"/>
-          <w:b w:val="0"/>
-          <w:i w:val="0"/>
-          <w:color w:val="2B2B2B"/>
-          <w:sz w:val="23"/>
-        </w:rPr>
-        <w:t>Chaque critère mesurable du cahier des charges est atteint ou dépassé.</w:t>
-      </w:r>
-    </w:p>
-    <w:p>
-      <w:pPr>
-        <w:spacing w:after="40" w:before="280"/>
-      </w:pPr>
-      <w:r>
-        <w:rPr>
-          <w:rFonts w:ascii="Cambria" w:hAnsi="Cambria"/>
-          <w:b/>
-          <w:i w:val="0"/>
-          <w:color w:val="2C5F2D"/>
-          <w:sz w:val="34"/>
-        </w:rPr>
-        <w:t>Diapositive 13 — Compétences Bachelor 2</w:t>
-      </w:r>
-    </w:p>
-    <w:p>
-      <w:pPr>
-        <w:spacing w:after="80"/>
-      </w:pPr>
-      <w:r>
-        <w:rPr>
-          <w:rFonts w:ascii="Calibri" w:hAnsi="Calibri"/>
-          <w:b/>
-          <w:color w:val="2C5F2D"/>
-          <w:sz w:val="21"/>
-        </w:rPr>
-        <w:t xml:space="preserve">Durée : </w:t>
-      </w:r>
-      <w:r>
-        <w:rPr>
-          <w:rFonts w:ascii="Calibri" w:hAnsi="Calibri"/>
-          <w:color w:val="2B2B2B"/>
-          <w:sz w:val="21"/>
-        </w:rPr>
-        <w:t>45 secondes</w:t>
-      </w:r>
-    </w:p>
-    <w:p>
-      <w:pPr>
-        <w:spacing w:after="80"/>
-      </w:pPr>
-      <w:r>
-        <w:rPr>
-          <w:rFonts w:ascii="Calibri" w:hAnsi="Calibri"/>
-          <w:b/>
-          <w:color w:val="2C5F2D"/>
-          <w:sz w:val="21"/>
-        </w:rPr>
-        <w:t xml:space="preserve">À l'écran : </w:t>
-      </w:r>
-      <w:r>
-        <w:rPr>
-          <w:rFonts w:ascii="Calibri" w:hAnsi="Calibri"/>
-          <w:color w:val="2B2B2B"/>
-          <w:sz w:val="21"/>
-        </w:rPr>
-        <w:t>Les cinq domaines couverts, numérotés.</w:t>
-      </w:r>
-    </w:p>
-    <w:p>
-      <w:pPr>
-        <w:spacing w:after="40" w:before="0"/>
-      </w:pPr>
-    </w:p>
-    <w:p>
-      <w:pPr>
-        <w:spacing w:after="160" w:before="0"/>
-      </w:pPr>
-      <w:r>
-        <w:rPr>
-          <w:rFonts w:ascii="Calibri" w:hAnsi="Calibri"/>
-          <w:b w:val="0"/>
-          <w:i w:val="0"/>
-          <w:color w:val="2B2B2B"/>
-          <w:sz w:val="23"/>
-        </w:rPr>
-        <w:t>Ce projet couvre les cinq domaines du Bachelor 2 : l'intelligence artificielle avec l'analyse d'image, le développement backend avec l'API et l'ORM, le développement frontend responsive, les bases de données relationnelles, et le DevOps avec Docker et le cloud.</w:t>
-      </w:r>
-    </w:p>
-    <w:p>
-      <w:pPr>
-        <w:spacing w:after="160" w:before="0"/>
-      </w:pPr>
-      <w:r>
-        <w:rPr>
-          <w:rFonts w:ascii="Calibri" w:hAnsi="Calibri"/>
-          <w:b w:val="0"/>
-          <w:i w:val="0"/>
-          <w:color w:val="2B2B2B"/>
-          <w:sz w:val="23"/>
-        </w:rPr>
-        <w:t>C'est un projet complet, pas un exercice isolé.</w:t>
-      </w:r>
-    </w:p>
-    <w:p>
-      <w:pPr>
-        <w:spacing w:after="40" w:before="280"/>
-      </w:pPr>
-      <w:r>
-        <w:rPr>
-          <w:rFonts w:ascii="Cambria" w:hAnsi="Cambria"/>
-          <w:b/>
-          <w:i w:val="0"/>
-          <w:color w:val="2C5F2D"/>
-          <w:sz w:val="34"/>
-        </w:rPr>
-        <w:t>Diapositive 14 — Conclusion</w:t>
-      </w:r>
-    </w:p>
-    <w:p>
-      <w:pPr>
-        <w:spacing w:after="80"/>
-      </w:pPr>
-      <w:r>
-        <w:rPr>
-          <w:rFonts w:ascii="Calibri" w:hAnsi="Calibri"/>
-          <w:b/>
-          <w:color w:val="2C5F2D"/>
-          <w:sz w:val="21"/>
-        </w:rPr>
-        <w:t xml:space="preserve">Durée : </w:t>
-      </w:r>
-      <w:r>
-        <w:rPr>
-          <w:rFonts w:ascii="Calibri" w:hAnsi="Calibri"/>
-          <w:color w:val="2B2B2B"/>
-          <w:sz w:val="21"/>
-        </w:rPr>
-        <w:t>1 minute</w:t>
-      </w:r>
-    </w:p>
-    <w:p>
-      <w:pPr>
-        <w:spacing w:after="80"/>
-      </w:pPr>
-      <w:r>
-        <w:rPr>
-          <w:rFonts w:ascii="Calibri" w:hAnsi="Calibri"/>
-          <w:b/>
-          <w:color w:val="2C5F2D"/>
-          <w:sz w:val="21"/>
-        </w:rPr>
-        <w:t xml:space="preserve">À l'écran : </w:t>
-      </w:r>
-      <w:r>
-        <w:rPr>
-          <w:rFonts w:ascii="Calibri" w:hAnsi="Calibri"/>
-          <w:color w:val="2B2B2B"/>
-          <w:sz w:val="21"/>
-        </w:rPr>
-        <w:t>Quatre qualités du projet et une phrase de synthèse.</w:t>
-      </w:r>
-    </w:p>
-    <w:p>
-      <w:pPr>
-        <w:spacing w:after="40" w:before="0"/>
-      </w:pPr>
-    </w:p>
-    <w:p>
-      <w:pPr>
-        <w:spacing w:after="160" w:before="0"/>
-      </w:pPr>
-      <w:r>
-        <w:rPr>
-          <w:rFonts w:ascii="Calibri" w:hAnsi="Calibri"/>
-          <w:b w:val="0"/>
-          <w:i w:val="0"/>
-          <w:color w:val="2B2B2B"/>
-          <w:sz w:val="23"/>
-        </w:rPr>
-        <w:t>En conclusion, PlantDiag est fonctionnel — l'application tourne en production et reste accessible en continu. Il est conforme : tous les objectifs du cahier des charges sont couverts. Il est documenté : architecture réseau, justifications techniques et guide de déploiement. Et il est évolutif : l'architecture supporte la montée en charge sans réécriture.</w:t>
-      </w:r>
-    </w:p>
-    <w:p>
-      <w:pPr>
-        <w:spacing w:after="160" w:before="0"/>
-      </w:pPr>
-      <w:r>
-        <w:rPr>
-          <w:rFonts w:ascii="Calibri" w:hAnsi="Calibri"/>
-          <w:b w:val="0"/>
-          <w:i w:val="0"/>
-          <w:color w:val="2B2B2B"/>
-          <w:sz w:val="23"/>
-        </w:rPr>
-        <w:t>PlantDiag est immédiatement utilisable par un agriculteur, depuis son téléphone, dans son champ.</w:t>
-      </w:r>
-    </w:p>
-    <w:p>
-      <w:pPr>
-        <w:spacing w:after="40" w:before="280"/>
-      </w:pPr>
-      <w:r>
-        <w:rPr>
-          <w:rFonts w:ascii="Cambria" w:hAnsi="Cambria"/>
-          <w:b/>
-          <w:i w:val="0"/>
-          <w:color w:val="2C5F2D"/>
-          <w:sz w:val="34"/>
-        </w:rPr>
-        <w:t>Diapositive 15 — Questions</w:t>
-      </w:r>
-    </w:p>
-    <w:p>
-      <w:pPr>
-        <w:spacing w:after="80"/>
-      </w:pPr>
-      <w:r>
-        <w:rPr>
-          <w:rFonts w:ascii="Calibri" w:hAnsi="Calibri"/>
-          <w:b/>
-          <w:color w:val="2C5F2D"/>
-          <w:sz w:val="21"/>
-        </w:rPr>
-        <w:t xml:space="preserve">Durée : </w:t>
-      </w:r>
-      <w:r>
-        <w:rPr>
-          <w:rFonts w:ascii="Calibri" w:hAnsi="Calibri"/>
-          <w:color w:val="2B2B2B"/>
-          <w:sz w:val="21"/>
-        </w:rPr>
-        <w:t>1 min 30</w:t>
-      </w:r>
-    </w:p>
-    <w:p>
-      <w:pPr>
-        <w:spacing w:after="80"/>
-      </w:pPr>
-      <w:r>
-        <w:rPr>
-          <w:rFonts w:ascii="Calibri" w:hAnsi="Calibri"/>
-          <w:b/>
-          <w:color w:val="2C5F2D"/>
-          <w:sz w:val="21"/>
-        </w:rPr>
-        <w:t xml:space="preserve">À l'écran : </w:t>
-      </w:r>
-      <w:r>
-        <w:rPr>
-          <w:rFonts w:ascii="Calibri" w:hAnsi="Calibri"/>
-          <w:color w:val="2B2B2B"/>
-          <w:sz w:val="21"/>
-        </w:rPr>
         <w:t>Les trois adresses : application, documentation API et code source.</w:t>
       </w:r>
     </w:p>
@@ -2219,22 +2133,7 @@
           <w:color w:val="2B2B2B"/>
           <w:sz w:val="23"/>
         </w:rPr>
-        <w:t>L'application est accessible à l'adresse affichée, la documentation de l'API sur slash docs, et l'intégralité du code source sur GitHub.</w:t>
-      </w:r>
-    </w:p>
-    <w:p>
-      <w:pPr>
-        <w:spacing w:after="160" w:before="0"/>
-      </w:pPr>
-      <w:r>
-        <w:rPr>
-          <w:rFonts w:ascii="Calibri" w:hAnsi="Calibri"/>
-          <w:b w:val="0"/>
-          <w:i w:val="0"/>
-          <w:color w:val="2B2B2B"/>
-          <w:sz w:val="23"/>
-        </w:rPr>
-        <w:t>Je suis à votre disposition pour vos questions.</w:t>
+        <w:t>L'application, la documentation de l'API et le code source complet sont aux adresses affichées. Je suis à votre disposition pour vos questions.</w:t>
       </w:r>
     </w:p>
     <w:p>
@@ -2269,6 +2168,96 @@
           <w:color w:val="2C5F2D"/>
           <w:sz w:val="25"/>
         </w:rPr>
+        <w:t>Les capteurs sont-ils réels ?</w:t>
+      </w:r>
+    </w:p>
+    <w:p>
+      <w:pPr>
+        <w:spacing w:after="80" w:before="0"/>
+      </w:pPr>
+      <w:r>
+        <w:rPr>
+          <w:rFonts w:ascii="Calibri" w:hAnsi="Calibri"/>
+          <w:b w:val="0"/>
+          <w:i w:val="0"/>
+          <w:color w:val="2B2B2B"/>
+          <w:sz w:val="23"/>
+        </w:rPr>
+        <w:t>Non, ils sont simulés par un conteneur dédié, et le cahier des charges l'autorise explicitement : « capteurs IoT simulés ou réels ». Le point important est que la simulation s'arrête au boîtier : les trames partent en HTTP vers l'API exactement comme le feraient de vrais capteurs, et le serveur ne sait pas d'où elles viennent.</w:t>
+      </w:r>
+    </w:p>
+    <w:p>
+      <w:pPr>
+        <w:spacing w:after="60" w:before="200"/>
+      </w:pPr>
+      <w:r>
+        <w:rPr>
+          <w:rFonts w:ascii="Calibri" w:hAnsi="Calibri"/>
+          <w:b/>
+          <w:i w:val="0"/>
+          <w:color w:val="2C5F2D"/>
+          <w:sz w:val="25"/>
+        </w:rPr>
+        <w:t>Comment passeriez-vous à de vrais capteurs ?</w:t>
+      </w:r>
+    </w:p>
+    <w:p>
+      <w:pPr>
+        <w:spacing w:after="80" w:before="0"/>
+      </w:pPr>
+      <w:r>
+        <w:rPr>
+          <w:rFonts w:ascii="Calibri" w:hAnsi="Calibri"/>
+          <w:b w:val="0"/>
+          <w:i w:val="0"/>
+          <w:color w:val="2B2B2B"/>
+          <w:sz w:val="23"/>
+        </w:rPr>
+        <w:t>En remplaçant le conteneur par des boîtiers physiques qui envoient la même trame JSON sur le même endpoint, via une passerelle LoRaWAN ou une carte 4G. Aucune ligne de l'API ne changerait. C'est pour cela que j'ai choisi HTTP plutôt qu'un protocole propriétaire.</w:t>
+      </w:r>
+    </w:p>
+    <w:p>
+      <w:pPr>
+        <w:spacing w:after="60" w:before="200"/>
+      </w:pPr>
+      <w:r>
+        <w:rPr>
+          <w:rFonts w:ascii="Calibri" w:hAnsi="Calibri"/>
+          <w:b/>
+          <w:i w:val="0"/>
+          <w:color w:val="2C5F2D"/>
+          <w:sz w:val="25"/>
+        </w:rPr>
+        <w:t>Pourquoi mesurer l'humectation du feuillage ?</w:t>
+      </w:r>
+    </w:p>
+    <w:p>
+      <w:pPr>
+        <w:spacing w:after="80" w:before="0"/>
+      </w:pPr>
+      <w:r>
+        <w:rPr>
+          <w:rFonts w:ascii="Calibri" w:hAnsi="Calibri"/>
+          <w:b w:val="0"/>
+          <w:i w:val="0"/>
+          <w:color w:val="2B2B2B"/>
+          <w:sz w:val="23"/>
+        </w:rPr>
+        <w:t>Parce que c'est le facteur déclenchant des maladies fongiques. Une spore a besoin d'eau libre sur la feuille pour germer, et d'une température douce. L'humidité de l'air ne suffit pas à le dire : après une averse, le feuillage reste mouillé même si l'air s'assèche.</w:t>
+      </w:r>
+    </w:p>
+    <w:p>
+      <w:pPr>
+        <w:spacing w:after="60" w:before="200"/>
+      </w:pPr>
+      <w:r>
+        <w:rPr>
+          <w:rFonts w:ascii="Calibri" w:hAnsi="Calibri"/>
+          <w:b/>
+          <w:i w:val="0"/>
+          <w:color w:val="2C5F2D"/>
+          <w:sz w:val="25"/>
+        </w:rPr>
         <w:t>Pourquoi FastAPI plutôt que Node.js ?</w:t>
       </w:r>
     </w:p>
@@ -2314,7 +2303,7 @@
           <w:color w:val="2B2B2B"/>
           <w:sz w:val="23"/>
         </w:rPr>
-        <w:t>C'est de la vision par ordinateur classique, pas du deep learning. OpenCV extrait des caractéristiques de l'image — couleur dominante, saturation, contraste, texture — et je les compare aux signatures des cinq maladies. Cela donne 87 % de précision pour un temps de calcul très faible.</w:t>
+        <w:t>C'est de la vision par ordinateur classique, pas du deep learning. OpenCV extrait des caractéristiques de l'image — couleur dominante, saturation, contraste, texture — et je les compare aux signatures des cinq maladies. 87 % de précision pour un temps de calcul très faible.</w:t>
       </w:r>
     </w:p>
     <w:p>
@@ -2344,7 +2333,7 @@
           <w:color w:val="2B2B2B"/>
           <w:sz w:val="23"/>
         </w:rPr>
-        <w:t>Parce qu'un réseau de neurones convolutif atteindrait un meilleur score, mais demanderait un jeu de données annoté, un entraînement et beaucoup plus de ressources serveur. Pour un agriculteur qui cherche une première indication fiable en une seconde, 87 % est pertinent. C'est aussi une évolution possible du projet.</w:t>
+        <w:t>Parce qu'un réseau de neurones convolutif ferait mieux, mais demanderait un jeu de données annoté, un entraînement et beaucoup plus de ressources serveur. Pour un agriculteur qui cherche une première indication fiable en une seconde, 87 % est pertinent. C'est aussi une évolution possible du projet.</w:t>
       </w:r>
     </w:p>
     <w:p>
@@ -2374,7 +2363,7 @@
           <w:color w:val="2B2B2B"/>
           <w:sz w:val="23"/>
         </w:rPr>
-        <w:t>Parce que le modèle est relationnel : un utilisateur possède des parcelles, une parcelle porte des diagnostics. PostgreSQL garantit les transactions ACID, donc aucune donnée incohérente même en cas de panne.</w:t>
+        <w:t>Parce que le modèle est relationnel : un utilisateur possède des parcelles, une parcelle porte des diagnostics et des relevés de capteurs. PostgreSQL garantit les transactions ACID, donc aucune donnée incohérente même en cas de panne.</w:t>
       </w:r>
     </w:p>
     <w:p>
@@ -2404,7 +2393,7 @@
           <w:color w:val="2B2B2B"/>
           <w:sz w:val="23"/>
         </w:rPr>
-        <w:t>Oui. Aujourd'hui une seule instance EC2 suffit pour une centaine d'utilisateurs. L'étape suivante serait un groupe d'auto-scaling derrière un répartiteur de charge, puis des réplicas en lecture sur la base. L'architecture ne change pas, seul le nombre d'instances évolue.</w:t>
+        <w:t>Oui. Une seule instance EC2 suffit aujourd'hui. L'étape suivante serait un groupe d'auto-scaling derrière un répartiteur de charge, puis des réplicas en lecture. Pour les capteurs, le volume est faible : une trame par minute et par parcelle, soit environ 1 440 lignes par parcelle et par jour.</w:t>
       </w:r>
     </w:p>
     <w:p>
@@ -2434,7 +2423,7 @@
           <w:color w:val="2B2B2B"/>
           <w:sz w:val="23"/>
         </w:rPr>
-        <w:t>Le logiciel est entièrement open source, donc zéro euro de licence. Côté hébergement, AWS est gratuit pendant douze mois, puis environ cinq à dix euros par mois pour une instance t2.micro.</w:t>
+        <w:t>Le logiciel est entièrement open source, donc zéro euro de licence. Côté hébergement, AWS est gratuit pendant douze mois, puis environ cinq à dix euros par mois. Le coût réel d'un déploiement serait celui des capteurs physiques.</w:t>
       </w:r>
     </w:p>
     <w:p>
@@ -2464,7 +2453,37 @@
           <w:color w:val="2B2B2B"/>
           <w:sz w:val="23"/>
         </w:rPr>
-        <w:t>Oui : authentification par jeton JWT, mots de passe hachés avec Bcrypt et sel, validation systématique des données entrantes, CORS configuré et isolation par utilisateur. Le passage en HTTPS via Let's Encrypt ne demande aucune modification du code.</w:t>
+        <w:t>Oui : jetons JWT, mots de passe hachés avec Bcrypt, validation systématique des données entrantes, CORS configuré et isolation par utilisateur. Le passage en HTTPS via Let's Encrypt ne demande aucune modification du code.</w:t>
+      </w:r>
+    </w:p>
+    <w:p>
+      <w:pPr>
+        <w:spacing w:after="60" w:before="200"/>
+      </w:pPr>
+      <w:r>
+        <w:rPr>
+          <w:rFonts w:ascii="Calibri" w:hAnsi="Calibri"/>
+          <w:b/>
+          <w:i w:val="0"/>
+          <w:color w:val="2C5F2D"/>
+          <w:sz w:val="25"/>
+        </w:rPr>
+        <w:t>Que se passe-t-il si un capteur tombe en panne ?</w:t>
+      </w:r>
+    </w:p>
+    <w:p>
+      <w:pPr>
+        <w:spacing w:after="80" w:before="0"/>
+      </w:pPr>
+      <w:r>
+        <w:rPr>
+          <w:rFonts w:ascii="Calibri" w:hAnsi="Calibri"/>
+          <w:b w:val="0"/>
+          <w:i w:val="0"/>
+          <w:color w:val="2B2B2B"/>
+          <w:sz w:val="23"/>
+        </w:rPr>
+        <w:t>Le serveur le détecte : au-delà de quinze minutes sans trame, le capteur est marqué hors ligne dans l'onglet Capteurs et une alerte de maintenance remonte. La même logique surveille le niveau de batterie et prévient sous 20 %.</w:t>
       </w:r>
     </w:p>
     <w:p>
@@ -2494,37 +2513,7 @@
           <w:color w:val="2B2B2B"/>
           <w:sz w:val="23"/>
         </w:rPr>
-        <w:t>Oui, l'interface est responsive et s'ouvre dans le navigateur d'un iPhone ou d'un Android. Aucune installation n'est nécessaire, et l'appareil photo du téléphone est directement utilisable pour la prise de vue.</w:t>
-      </w:r>
-    </w:p>
-    <w:p>
-      <w:pPr>
-        <w:spacing w:after="60" w:before="200"/>
-      </w:pPr>
-      <w:r>
-        <w:rPr>
-          <w:rFonts w:ascii="Calibri" w:hAnsi="Calibri"/>
-          <w:b/>
-          <w:i w:val="0"/>
-          <w:color w:val="2C5F2D"/>
-          <w:sz w:val="25"/>
-        </w:rPr>
-        <w:t>Que se passe-t-il si le serveur tombe ?</w:t>
-      </w:r>
-    </w:p>
-    <w:p>
-      <w:pPr>
-        <w:spacing w:after="80" w:before="0"/>
-      </w:pPr>
-      <w:r>
-        <w:rPr>
-          <w:rFonts w:ascii="Calibri" w:hAnsi="Calibri"/>
-          <w:b w:val="0"/>
-          <w:i w:val="0"/>
-          <w:color w:val="2B2B2B"/>
-          <w:sz w:val="23"/>
-        </w:rPr>
-        <w:t>Les volumes Docker sont persistants : au redémarrage des conteneurs, les données sont intactes. Pour une mise en production réelle, on ajouterait des sauvegardes automatiques via AWS RDS.</w:t>
+        <w:t>Oui, l'interface est responsive et s'ouvre dans le navigateur d'un iPhone ou d'un Android. Aucune installation n'est nécessaire, et l'appareil photo est directement utilisable.</w:t>
       </w:r>
     </w:p>
     <w:p>
@@ -2568,6 +2557,18 @@
         <w:rPr>
           <w:sz w:val="23"/>
         </w:rPr>
+        <w:t>Ouvrir l'onglet Capteurs et vérifier que les deux capteurs sont en ligne.</w:t>
+      </w:r>
+    </w:p>
+    <w:p>
+      <w:pPr>
+        <w:pStyle w:val="ListBullet"/>
+        <w:spacing w:after="100"/>
+      </w:pPr>
+      <w:r>
+        <w:rPr>
+          <w:sz w:val="23"/>
+        </w:rPr>
         <w:t>Ouvrir la documentation Swagger dans un second onglet.</w:t>
       </w:r>
     </w:p>
@@ -2592,18 +2593,6 @@
         <w:rPr>
           <w:sz w:val="23"/>
         </w:rPr>
-        <w:t>Créer une parcelle de test à l'avance, au cas où le réseau serait lent.</w:t>
-      </w:r>
-    </w:p>
-    <w:p>
-      <w:pPr>
-        <w:pStyle w:val="ListBullet"/>
-        <w:spacing w:after="100"/>
-      </w:pPr>
-      <w:r>
-        <w:rPr>
-          <w:sz w:val="23"/>
-        </w:rPr>
         <w:t>Vérifier la connexion au réseau de la salle.</w:t>
       </w:r>
     </w:p>
@@ -2628,7 +2617,7 @@
         <w:rPr>
           <w:sz w:val="23"/>
         </w:rPr>
-        <w:t>Prévoir une capture d'écran du diagnostic en secours, si le réseau tombe.</w:t>
+        <w:t>Prévoir une capture d'écran du diagnostic et du réseau de capteurs, si le réseau tombe.</w:t>
       </w:r>
     </w:p>
     <w:p>

</xml_diff>

<commit_message>
docs: add farmer field-validation testimonial to the conclusion
Brother (farmer) tested it on his own farm; father (agricultural
commercial) brought it to other farmers in the field. Their main
feedback was centralized data and weather-coupled disease-risk
anticipation.

Co-Authored-By: Claude Sonnet 5 <noreply@anthropic.com>
</commit_message>
<xml_diff>
--- a/SOUTENANCE.docx
+++ b/SOUTENANCE.docx
@@ -451,7 +451,7 @@
               <w:rPr>
                 <w:sz w:val="22"/>
               </w:rPr>
-              <w:t>2 min 25</w:t>
+              <w:t>2 min 50</w:t>
             </w:r>
           </w:p>
         </w:tc>
@@ -2012,7 +2012,7 @@
           <w:color w:val="2B2B2B"/>
           <w:sz w:val="21"/>
         </w:rPr>
-        <w:t>30 secondes</w:t>
+        <w:t>55 secondes</w:t>
       </w:r>
     </w:p>
     <w:p>
@@ -2034,7 +2034,7 @@
           <w:color w:val="2B2B2B"/>
           <w:sz w:val="21"/>
         </w:rPr>
-        <w:t>Quatre qualités du projet et une phrase de synthèse.</w:t>
+        <w:t>Quatre qualités du projet, un retour terrain, une phrase de synthèse.</w:t>
       </w:r>
     </w:p>
     <w:p>
@@ -2069,7 +2069,37 @@
           <w:color w:val="2B2B2B"/>
           <w:sz w:val="23"/>
         </w:rPr>
-        <w:t>Il est immédiatement utilisable par un agriculteur, depuis son téléphone, dans son champ.</w:t>
+        <w:t>Mais je voulais surtout le tester en dehors de l'école. Mon frère est agriculteur, il l'a testé directement dans sa ferme. Et mon père, qui est commercial dans le secteur agricole, m'a emmené sur le terrain pour le faire essayer à plusieurs autres agriculteurs.</w:t>
+      </w:r>
+    </w:p>
+    <w:p>
+      <w:pPr>
+        <w:spacing w:after="160" w:before="0"/>
+      </w:pPr>
+      <w:r>
+        <w:rPr>
+          <w:rFonts w:ascii="Calibri" w:hAnsi="Calibri"/>
+          <w:b w:val="0"/>
+          <w:i w:val="0"/>
+          <w:color w:val="2B2B2B"/>
+          <w:sz w:val="23"/>
+        </w:rPr>
+        <w:t>Le retour qui est revenu le plus souvent, ce n'est pas le diagnostic en lui-même : c'est d'avoir toutes leurs données centralisées au même endroit, et surtout la météo couplée aux risques de maladie, pour pouvoir anticiper avant que le problème n'apparaisse plutôt que de le découvrir une fois qu'il est trop tard.</w:t>
+      </w:r>
+    </w:p>
+    <w:p>
+      <w:pPr>
+        <w:spacing w:after="160" w:before="0"/>
+      </w:pPr>
+      <w:r>
+        <w:rPr>
+          <w:rFonts w:ascii="Calibri" w:hAnsi="Calibri"/>
+          <w:b w:val="0"/>
+          <w:i w:val="0"/>
+          <w:color w:val="2B2B2B"/>
+          <w:sz w:val="23"/>
+        </w:rPr>
+        <w:t>C'est immédiatement utilisable par un agriculteur, depuis son téléphone, dans son champ - et c'est un retour de vrais agriculteurs qui me le confirme, pas seulement moi.</w:t>
       </w:r>
     </w:p>
     <w:p>

</xml_diff>